<commit_message>
nmv  03 06 2026
</commit_message>
<xml_diff>
--- a/TS Jatai Ghanam Project/TS 1.5/TS 1.5 Ghanam Malayalam Corrections.docx
+++ b/TS Jatai Ghanam Project/TS 1.5/TS 1.5 Ghanam Malayalam Corrections.docx
@@ -50,10 +50,9 @@
           <w:bCs/>
           <w:sz w:val="32"/>
           <w:szCs w:val="32"/>
-          <w:highlight w:val="red"/>
           <w:u w:val="single"/>
         </w:rPr>
-        <w:t>????</w:t>
+        <w:t>30th June 2026</w:t>
       </w:r>
     </w:p>
     <w:p>
@@ -2609,50 +2608,69 @@
           </w:p>
         </w:tc>
       </w:tr>
-      <w:tr>
-        <w:trPr>
-          <w:trHeight w:val="1197"/>
-        </w:trPr>
-        <w:tc>
-          <w:tcPr>
-            <w:tcW w:w="7166" w:type="dxa"/>
-          </w:tcPr>
-          <w:p>
-            <w:pPr>
-              <w:widowControl w:val="0"/>
-              <w:autoSpaceDE w:val="0"/>
-              <w:autoSpaceDN w:val="0"/>
-              <w:adjustRightInd w:val="0"/>
-              <w:spacing w:before="0" w:line="240" w:lineRule="auto"/>
-              <w:rPr>
-                <w:rFonts w:cs="BRH Malayalam Extra"/>
-                <w:szCs w:val="40"/>
-              </w:rPr>
-            </w:pPr>
-          </w:p>
-        </w:tc>
-        <w:tc>
-          <w:tcPr>
-            <w:tcW w:w="7229" w:type="dxa"/>
-          </w:tcPr>
-          <w:p>
-            <w:pPr>
-              <w:widowControl w:val="0"/>
-              <w:autoSpaceDE w:val="0"/>
-              <w:autoSpaceDN w:val="0"/>
-              <w:adjustRightInd w:val="0"/>
-              <w:spacing w:before="0" w:line="240" w:lineRule="auto"/>
-              <w:rPr>
-                <w:rFonts w:cs="BRH Malayalam Extra"/>
-                <w:b/>
-                <w:bCs/>
-                <w:szCs w:val="40"/>
-              </w:rPr>
-            </w:pPr>
-          </w:p>
-        </w:tc>
-      </w:tr>
     </w:tbl>
+    <w:p>
+      <w:pPr>
+        <w:spacing w:before="0" w:line="240" w:lineRule="auto"/>
+        <w:jc w:val="center"/>
+        <w:rPr>
+          <w:b/>
+          <w:bCs/>
+          <w:sz w:val="32"/>
+          <w:szCs w:val="32"/>
+          <w:u w:val="single"/>
+        </w:rPr>
+      </w:pPr>
+      <w:r>
+        <w:rPr>
+          <w:b/>
+          <w:bCs/>
+          <w:sz w:val="32"/>
+          <w:szCs w:val="32"/>
+          <w:u w:val="single"/>
+        </w:rPr>
+        <w:t>=========</w:t>
+      </w:r>
+    </w:p>
+    <w:p>
+      <w:pPr>
+        <w:spacing w:before="0" w:line="240" w:lineRule="auto"/>
+        <w:jc w:val="center"/>
+        <w:rPr>
+          <w:b/>
+          <w:bCs/>
+          <w:sz w:val="32"/>
+          <w:szCs w:val="32"/>
+          <w:u w:val="single"/>
+        </w:rPr>
+      </w:pPr>
+    </w:p>
+    <w:p>
+      <w:pPr>
+        <w:spacing w:before="0" w:line="240" w:lineRule="auto"/>
+        <w:jc w:val="center"/>
+        <w:rPr>
+          <w:b/>
+          <w:bCs/>
+          <w:sz w:val="32"/>
+          <w:szCs w:val="32"/>
+          <w:u w:val="single"/>
+        </w:rPr>
+      </w:pPr>
+    </w:p>
+    <w:p>
+      <w:pPr>
+        <w:spacing w:before="0" w:line="240" w:lineRule="auto"/>
+        <w:jc w:val="center"/>
+        <w:rPr>
+          <w:b/>
+          <w:bCs/>
+          <w:sz w:val="32"/>
+          <w:szCs w:val="32"/>
+          <w:u w:val="single"/>
+        </w:rPr>
+      </w:pPr>
+    </w:p>
     <w:p>
       <w:pPr>
         <w:spacing w:before="0" w:line="240" w:lineRule="auto"/>
@@ -2712,6 +2730,7 @@
           <w:szCs w:val="32"/>
           <w:u w:val="single"/>
         </w:rPr>
+        <w:lastRenderedPageBreak/>
         <w:t>TS Ghanam – TS 1.</w:t>
       </w:r>
       <w:r>
@@ -2783,7 +2802,6 @@
           <w:sz w:val="28"/>
           <w:szCs w:val="32"/>
         </w:rPr>
-        <w:lastRenderedPageBreak/>
         <w:t>(ignore those which are already incorporated in your book’s version and date)</w:t>
       </w:r>
     </w:p>
@@ -5120,6 +5138,7 @@
                 <w:rFonts w:cs="BRH Malayalam Extra"/>
                 <w:szCs w:val="40"/>
               </w:rPr>
+              <w:lastRenderedPageBreak/>
               <w:t>57</w:t>
             </w:r>
             <w:r>
@@ -5258,7 +5277,6 @@
                 <w:sz w:val="32"/>
                 <w:szCs w:val="40"/>
               </w:rPr>
-              <w:lastRenderedPageBreak/>
               <w:t>px</w:t>
             </w:r>
             <w:r>
@@ -6651,6 +6669,7 @@
                 <w:rFonts w:cs="BRH Malayalam Extra"/>
                 <w:szCs w:val="40"/>
               </w:rPr>
+              <w:lastRenderedPageBreak/>
               <w:t>57</w:t>
             </w:r>
             <w:r>
@@ -6789,7 +6808,6 @@
                 <w:sz w:val="32"/>
                 <w:szCs w:val="40"/>
               </w:rPr>
-              <w:lastRenderedPageBreak/>
               <w:t>px</w:t>
             </w:r>
             <w:r>
@@ -15379,25 +15397,12 @@
                 <w:szCs w:val="40"/>
               </w:rPr>
             </w:pPr>
-          </w:p>
-          <w:p>
-            <w:pPr>
-              <w:widowControl w:val="0"/>
-              <w:autoSpaceDE w:val="0"/>
-              <w:autoSpaceDN w:val="0"/>
-              <w:adjustRightInd w:val="0"/>
-              <w:spacing w:before="0" w:line="240" w:lineRule="auto"/>
-              <w:rPr>
-                <w:rFonts w:ascii="BRH Malayalam Extra" w:hAnsi="BRH Malayalam Extra" w:cs="BRH Malayalam Extra"/>
-                <w:sz w:val="32"/>
-                <w:szCs w:val="40"/>
-              </w:rPr>
-            </w:pPr>
-            <w:r>
-              <w:rPr>
-                <w:rFonts w:cs="BRH Malayalam Extra"/>
-                <w:szCs w:val="40"/>
-              </w:rPr>
+            <w:r>
+              <w:rPr>
+                <w:rFonts w:cs="BRH Malayalam Extra"/>
+                <w:szCs w:val="40"/>
+              </w:rPr>
+              <w:lastRenderedPageBreak/>
               <w:t>17</w:t>
             </w:r>
             <w:r>
@@ -17278,25 +17283,12 @@
                 <w:szCs w:val="40"/>
               </w:rPr>
             </w:pPr>
-          </w:p>
-          <w:p>
-            <w:pPr>
-              <w:widowControl w:val="0"/>
-              <w:autoSpaceDE w:val="0"/>
-              <w:autoSpaceDN w:val="0"/>
-              <w:adjustRightInd w:val="0"/>
-              <w:spacing w:before="0" w:line="240" w:lineRule="auto"/>
-              <w:rPr>
-                <w:rFonts w:ascii="BRH Malayalam Extra" w:hAnsi="BRH Malayalam Extra" w:cs="BRH Malayalam Extra"/>
-                <w:sz w:val="32"/>
-                <w:szCs w:val="40"/>
-              </w:rPr>
-            </w:pPr>
-            <w:r>
-              <w:rPr>
-                <w:rFonts w:cs="BRH Malayalam Extra"/>
-                <w:szCs w:val="40"/>
-              </w:rPr>
+            <w:r>
+              <w:rPr>
+                <w:rFonts w:cs="BRH Malayalam Extra"/>
+                <w:szCs w:val="40"/>
+              </w:rPr>
+              <w:lastRenderedPageBreak/>
               <w:t>17</w:t>
             </w:r>
             <w:r>
@@ -19533,7 +19525,6 @@
                 <w:szCs w:val="40"/>
                 <w:lang w:val="it-IT"/>
               </w:rPr>
-              <w:lastRenderedPageBreak/>
               <w:t>B—j</w:t>
             </w:r>
             <w:r>
@@ -19683,7 +19674,6 @@
                 <w:szCs w:val="40"/>
                 <w:lang w:val="it-IT"/>
               </w:rPr>
-              <w:lastRenderedPageBreak/>
               <w:t>38</w:t>
             </w:r>
             <w:r>
@@ -20502,7 +20492,6 @@
                 <w:szCs w:val="40"/>
                 <w:lang w:val="it-IT"/>
               </w:rPr>
-              <w:lastRenderedPageBreak/>
               <w:t>B—j</w:t>
             </w:r>
             <w:r>
@@ -23467,7 +23456,6 @@
                 <w:szCs w:val="40"/>
                 <w:highlight w:val="yellow"/>
               </w:rPr>
-              <w:lastRenderedPageBreak/>
               <w:t>ex—pK ¥dx dJ expK bzby</w:t>
             </w:r>
             <w:r>
@@ -23510,6 +23498,176 @@
                 <w:szCs w:val="40"/>
               </w:rPr>
             </w:pPr>
+            <w:r>
+              <w:rPr>
+                <w:rFonts w:cs="BRH Malayalam Extra"/>
+                <w:szCs w:val="40"/>
+              </w:rPr>
+              <w:t>15</w:t>
+            </w:r>
+            <w:r>
+              <w:rPr>
+                <w:rFonts w:ascii="BRH Malayalam Extra" w:hAnsi="BRH Malayalam Extra" w:cs="BRH Malayalam Extra"/>
+                <w:sz w:val="32"/>
+                <w:szCs w:val="40"/>
+              </w:rPr>
+              <w:t>)</w:t>
+            </w:r>
+            <w:r>
+              <w:rPr>
+                <w:rFonts w:cs="BRH Malayalam Extra"/>
+                <w:szCs w:val="40"/>
+              </w:rPr>
+              <w:t xml:space="preserve">  1</w:t>
+            </w:r>
+            <w:r>
+              <w:rPr>
+                <w:rFonts w:ascii="BRH Malayalam Extra" w:hAnsi="BRH Malayalam Extra" w:cs="BRH Malayalam Extra"/>
+                <w:sz w:val="32"/>
+                <w:szCs w:val="40"/>
+              </w:rPr>
+              <w:t>.</w:t>
+            </w:r>
+            <w:r>
+              <w:rPr>
+                <w:rFonts w:cs="BRH Malayalam Extra"/>
+                <w:szCs w:val="40"/>
+              </w:rPr>
+              <w:t>5</w:t>
+            </w:r>
+            <w:r>
+              <w:rPr>
+                <w:rFonts w:ascii="BRH Malayalam Extra" w:hAnsi="BRH Malayalam Extra" w:cs="BRH Malayalam Extra"/>
+                <w:sz w:val="32"/>
+                <w:szCs w:val="40"/>
+              </w:rPr>
+              <w:t>.</w:t>
+            </w:r>
+            <w:r>
+              <w:rPr>
+                <w:rFonts w:cs="BRH Malayalam Extra"/>
+                <w:szCs w:val="40"/>
+              </w:rPr>
+              <w:t>5</w:t>
+            </w:r>
+            <w:r>
+              <w:rPr>
+                <w:rFonts w:ascii="BRH Malayalam Extra" w:hAnsi="BRH Malayalam Extra" w:cs="BRH Malayalam Extra"/>
+                <w:sz w:val="32"/>
+                <w:szCs w:val="40"/>
+              </w:rPr>
+              <w:t>.</w:t>
+            </w:r>
+            <w:r>
+              <w:rPr>
+                <w:rFonts w:cs="BRH Malayalam Extra"/>
+                <w:szCs w:val="40"/>
+              </w:rPr>
+              <w:t>3</w:t>
+            </w:r>
+            <w:r>
+              <w:rPr>
+                <w:rFonts w:ascii="BRH Malayalam Extra" w:hAnsi="BRH Malayalam Extra" w:cs="BRH Malayalam Extra"/>
+                <w:sz w:val="32"/>
+                <w:szCs w:val="40"/>
+              </w:rPr>
+              <w:t>(</w:t>
+            </w:r>
+            <w:r>
+              <w:rPr>
+                <w:rFonts w:cs="BRH Malayalam Extra"/>
+                <w:szCs w:val="40"/>
+              </w:rPr>
+              <w:t>15</w:t>
+            </w:r>
+            <w:r>
+              <w:rPr>
+                <w:rFonts w:ascii="BRH Malayalam Extra" w:hAnsi="BRH Malayalam Extra" w:cs="BRH Malayalam Extra"/>
+                <w:sz w:val="32"/>
+                <w:szCs w:val="40"/>
+              </w:rPr>
+              <w:t>)-  ex</w:t>
+            </w:r>
+            <w:r>
+              <w:rPr>
+                <w:rFonts w:ascii="BRH Malayalam Extra" w:hAnsi="BRH Malayalam Extra" w:cs="BRH Malayalam Extra"/>
+                <w:sz w:val="26"/>
+                <w:szCs w:val="40"/>
+              </w:rPr>
+              <w:t>–</w:t>
+            </w:r>
+            <w:r>
+              <w:rPr>
+                <w:rFonts w:ascii="BRH Malayalam Extra" w:hAnsi="BRH Malayalam Extra" w:cs="BRH Malayalam Extra"/>
+                <w:sz w:val="32"/>
+                <w:szCs w:val="40"/>
+              </w:rPr>
+              <w:t>p</w:t>
+            </w:r>
+            <w:r>
+              <w:rPr>
+                <w:rFonts w:ascii="BRH Malayalam Extra" w:hAnsi="BRH Malayalam Extra" w:cs="BRH Malayalam Extra"/>
+                <w:sz w:val="26"/>
+                <w:szCs w:val="40"/>
+              </w:rPr>
+              <w:t>–</w:t>
+            </w:r>
+            <w:r>
+              <w:rPr>
+                <w:rFonts w:ascii="BRH Malayalam Extra" w:hAnsi="BRH Malayalam Extra" w:cs="BRH Malayalam Extra"/>
+                <w:sz w:val="32"/>
+                <w:szCs w:val="40"/>
+              </w:rPr>
+              <w:t>K</w:t>
+            </w:r>
+            <w:r>
+              <w:rPr>
+                <w:rFonts w:ascii="BRH Malayalam Extra" w:hAnsi="BRH Malayalam Extra" w:cs="BRH Malayalam Extra"/>
+                <w:sz w:val="26"/>
+                <w:szCs w:val="40"/>
+              </w:rPr>
+              <w:t>–</w:t>
+            </w:r>
+            <w:r>
+              <w:rPr>
+                <w:rFonts w:ascii="BRH Malayalam Extra" w:hAnsi="BRH Malayalam Extra" w:cs="BRH Malayalam Extra"/>
+                <w:sz w:val="32"/>
+                <w:szCs w:val="40"/>
+              </w:rPr>
+              <w:t xml:space="preserve"> | bz</w:t>
+            </w:r>
+            <w:r>
+              <w:rPr>
+                <w:rFonts w:ascii="BRH Malayalam Extra" w:hAnsi="BRH Malayalam Extra" w:cs="BRH Malayalam Extra"/>
+                <w:sz w:val="26"/>
+                <w:szCs w:val="40"/>
+              </w:rPr>
+              <w:t>–</w:t>
+            </w:r>
+            <w:r>
+              <w:rPr>
+                <w:rFonts w:ascii="BRH Malayalam Extra" w:hAnsi="BRH Malayalam Extra" w:cs="BRH Malayalam Extra"/>
+                <w:sz w:val="32"/>
+                <w:szCs w:val="40"/>
+              </w:rPr>
+              <w:t>by</w:t>
+            </w:r>
+            <w:r>
+              <w:rPr>
+                <w:rFonts w:ascii="BRH Malayalam Extra" w:hAnsi="BRH Malayalam Extra" w:cs="BRH Malayalam Extra"/>
+                <w:sz w:val="26"/>
+                <w:szCs w:val="40"/>
+              </w:rPr>
+              <w:t>–</w:t>
+            </w:r>
+            <w:r>
+              <w:rPr>
+                <w:rFonts w:ascii="BRH Malayalam Extra" w:hAnsi="BRH Malayalam Extra" w:cs="BRH Malayalam Extra"/>
+                <w:sz w:val="32"/>
+                <w:szCs w:val="40"/>
+              </w:rPr>
+              <w:t>pJ | A¥²˜ |</w:t>
+            </w:r>
           </w:p>
           <w:p>
             <w:pPr>
@@ -23524,6 +23682,203 @@
                 <w:szCs w:val="40"/>
               </w:rPr>
             </w:pPr>
+            <w:r>
+              <w:rPr>
+                <w:rFonts w:ascii="BRH Malayalam Extra" w:hAnsi="BRH Malayalam Extra" w:cs="BRH Malayalam Extra"/>
+                <w:sz w:val="32"/>
+                <w:szCs w:val="40"/>
+              </w:rPr>
+              <w:t>ex</w:t>
+            </w:r>
+            <w:r>
+              <w:rPr>
+                <w:rFonts w:ascii="BRH Malayalam Extra" w:hAnsi="BRH Malayalam Extra" w:cs="BRH Malayalam Extra"/>
+                <w:sz w:val="26"/>
+                <w:szCs w:val="40"/>
+              </w:rPr>
+              <w:t>–</w:t>
+            </w:r>
+            <w:r>
+              <w:rPr>
+                <w:rFonts w:ascii="BRH Malayalam Extra" w:hAnsi="BRH Malayalam Extra" w:cs="BRH Malayalam Extra"/>
+                <w:sz w:val="32"/>
+                <w:szCs w:val="40"/>
+              </w:rPr>
+              <w:t>p</w:t>
+            </w:r>
+            <w:r>
+              <w:rPr>
+                <w:rFonts w:ascii="BRH Malayalam Extra" w:hAnsi="BRH Malayalam Extra" w:cs="BRH Malayalam Extra"/>
+                <w:sz w:val="26"/>
+                <w:szCs w:val="40"/>
+              </w:rPr>
+              <w:t>–</w:t>
+            </w:r>
+            <w:r>
+              <w:rPr>
+                <w:rFonts w:ascii="BRH Malayalam Extra" w:hAnsi="BRH Malayalam Extra" w:cs="BRH Malayalam Extra"/>
+                <w:sz w:val="32"/>
+                <w:szCs w:val="40"/>
+              </w:rPr>
+              <w:t>K</w:t>
+            </w:r>
+            <w:r>
+              <w:rPr>
+                <w:rFonts w:ascii="BRH Malayalam Extra" w:hAnsi="BRH Malayalam Extra" w:cs="BRH Malayalam Extra"/>
+                <w:sz w:val="26"/>
+                <w:szCs w:val="40"/>
+              </w:rPr>
+              <w:t>–</w:t>
+            </w:r>
+            <w:r>
+              <w:rPr>
+                <w:rFonts w:ascii="BRH Malayalam Extra" w:hAnsi="BRH Malayalam Extra" w:cs="BRH Malayalam Extra"/>
+                <w:sz w:val="32"/>
+                <w:szCs w:val="40"/>
+              </w:rPr>
+              <w:t xml:space="preserve"> bz</w:t>
+            </w:r>
+            <w:r>
+              <w:rPr>
+                <w:rFonts w:ascii="BRH Malayalam Extra" w:hAnsi="BRH Malayalam Extra" w:cs="BRH Malayalam Extra"/>
+                <w:sz w:val="26"/>
+                <w:szCs w:val="40"/>
+              </w:rPr>
+              <w:t>–</w:t>
+            </w:r>
+            <w:r>
+              <w:rPr>
+                <w:rFonts w:ascii="BRH Malayalam Extra" w:hAnsi="BRH Malayalam Extra" w:cs="BRH Malayalam Extra"/>
+                <w:sz w:val="32"/>
+                <w:szCs w:val="40"/>
+              </w:rPr>
+              <w:t>by</w:t>
+            </w:r>
+            <w:r>
+              <w:rPr>
+                <w:rFonts w:ascii="BRH Malayalam Extra" w:hAnsi="BRH Malayalam Extra" w:cs="BRH Malayalam Extra"/>
+                <w:sz w:val="26"/>
+                <w:szCs w:val="40"/>
+              </w:rPr>
+              <w:t>–</w:t>
+            </w:r>
+            <w:r>
+              <w:rPr>
+                <w:rFonts w:ascii="BRH Malayalam Extra" w:hAnsi="BRH Malayalam Extra" w:cs="BRH Malayalam Extra"/>
+                <w:sz w:val="32"/>
+                <w:szCs w:val="40"/>
+              </w:rPr>
+              <w:t>¥</w:t>
+            </w:r>
+            <w:r>
+              <w:rPr>
+                <w:rFonts w:ascii="BRH Malayalam Extra" w:hAnsi="BRH Malayalam Extra" w:cs="BRH Malayalam Extra"/>
+                <w:sz w:val="32"/>
+                <w:szCs w:val="40"/>
+                <w:highlight w:val="yellow"/>
+              </w:rPr>
+              <w:t>p</w:t>
+            </w:r>
+            <w:r>
+              <w:rPr>
+                <w:rFonts w:ascii="BRH Malayalam Extra" w:hAnsi="BRH Malayalam Extra" w:cs="BRH Malayalam Extra"/>
+                <w:sz w:val="32"/>
+                <w:szCs w:val="40"/>
+              </w:rPr>
+              <w:t xml:space="preserve">x </w:t>
+            </w:r>
+            <w:r>
+              <w:rPr>
+                <w:rFonts w:ascii="BRH Malayalam Extra" w:hAnsi="BRH Malayalam Extra" w:cs="BRH Malayalam Extra"/>
+                <w:sz w:val="32"/>
+                <w:szCs w:val="40"/>
+                <w:highlight w:val="yellow"/>
+              </w:rPr>
+              <w:t>bz</w:t>
+            </w:r>
+            <w:r>
+              <w:rPr>
+                <w:rFonts w:ascii="BRH Malayalam Extra" w:hAnsi="BRH Malayalam Extra" w:cs="BRH Malayalam Extra"/>
+                <w:sz w:val="32"/>
+                <w:szCs w:val="40"/>
+              </w:rPr>
+              <w:t>—by</w:t>
+            </w:r>
+            <w:r>
+              <w:rPr>
+                <w:rFonts w:ascii="BRH Malayalam Extra" w:hAnsi="BRH Malayalam Extra" w:cs="BRH Malayalam Extra"/>
+                <w:sz w:val="26"/>
+                <w:szCs w:val="40"/>
+              </w:rPr>
+              <w:t>–</w:t>
+            </w:r>
+            <w:r>
+              <w:rPr>
+                <w:rFonts w:ascii="BRH Malayalam Extra" w:hAnsi="BRH Malayalam Extra" w:cs="BRH Malayalam Extra"/>
+                <w:sz w:val="32"/>
+                <w:szCs w:val="40"/>
+                <w:highlight w:val="yellow"/>
+              </w:rPr>
+              <w:t>p</w:t>
+            </w:r>
+            <w:r>
+              <w:rPr>
+                <w:rFonts w:ascii="BRH Malayalam Extra" w:hAnsi="BRH Malayalam Extra" w:cs="BRH Malayalam Extra"/>
+                <w:sz w:val="32"/>
+                <w:szCs w:val="40"/>
+              </w:rPr>
+              <w:t xml:space="preserve">J </w:t>
+            </w:r>
+            <w:r>
+              <w:rPr>
+                <w:rFonts w:ascii="BRH Malayalam Extra" w:hAnsi="BRH Malayalam Extra" w:cs="BRH Malayalam Extra"/>
+                <w:sz w:val="32"/>
+                <w:szCs w:val="40"/>
+                <w:highlight w:val="yellow"/>
+              </w:rPr>
+              <w:t>ex—pK expK</w:t>
+            </w:r>
+            <w:r>
+              <w:rPr>
+                <w:rFonts w:ascii="BRH Malayalam Extra" w:hAnsi="BRH Malayalam Extra" w:cs="BRH Malayalam Extra"/>
+                <w:sz w:val="32"/>
+                <w:szCs w:val="40"/>
+              </w:rPr>
+              <w:t xml:space="preserve"> </w:t>
+            </w:r>
+            <w:r>
+              <w:rPr>
+                <w:rFonts w:ascii="BRH Malayalam Extra" w:hAnsi="BRH Malayalam Extra" w:cs="BRH Malayalam Extra"/>
+                <w:sz w:val="32"/>
+                <w:szCs w:val="40"/>
+                <w:highlight w:val="yellow"/>
+              </w:rPr>
+              <w:t>b</w:t>
+            </w:r>
+            <w:r>
+              <w:rPr>
+                <w:rFonts w:ascii="BRH Malayalam Extra" w:hAnsi="BRH Malayalam Extra" w:cs="BRH Malayalam Extra"/>
+                <w:sz w:val="32"/>
+                <w:szCs w:val="40"/>
+              </w:rPr>
+              <w:t>zby</w:t>
+            </w:r>
+            <w:r>
+              <w:rPr>
+                <w:rFonts w:ascii="BRH Malayalam Extra" w:hAnsi="BRH Malayalam Extra" w:cs="BRH Malayalam Extra"/>
+                <w:sz w:val="26"/>
+                <w:szCs w:val="40"/>
+              </w:rPr>
+              <w:t>–</w:t>
+            </w:r>
+            <w:r>
+              <w:rPr>
+                <w:rFonts w:ascii="BRH Malayalam Extra" w:hAnsi="BRH Malayalam Extra" w:cs="BRH Malayalam Extra"/>
+                <w:sz w:val="32"/>
+                <w:szCs w:val="40"/>
+              </w:rPr>
+              <w:t xml:space="preserve">¥px </w:t>
+            </w:r>
           </w:p>
           <w:p>
             <w:pPr>
@@ -23540,405 +23895,11 @@
             </w:pPr>
             <w:r>
               <w:rPr>
-                <w:rFonts w:cs="BRH Malayalam Extra"/>
-                <w:szCs w:val="40"/>
-              </w:rPr>
-              <w:t>15</w:t>
-            </w:r>
-            <w:r>
-              <w:rPr>
-                <w:rFonts w:ascii="BRH Malayalam Extra" w:hAnsi="BRH Malayalam Extra" w:cs="BRH Malayalam Extra"/>
-                <w:sz w:val="32"/>
-                <w:szCs w:val="40"/>
-              </w:rPr>
-              <w:t>)</w:t>
-            </w:r>
-            <w:r>
-              <w:rPr>
-                <w:rFonts w:cs="BRH Malayalam Extra"/>
-                <w:szCs w:val="40"/>
-              </w:rPr>
-              <w:t xml:space="preserve">  1</w:t>
-            </w:r>
-            <w:r>
-              <w:rPr>
-                <w:rFonts w:ascii="BRH Malayalam Extra" w:hAnsi="BRH Malayalam Extra" w:cs="BRH Malayalam Extra"/>
-                <w:sz w:val="32"/>
-                <w:szCs w:val="40"/>
-              </w:rPr>
-              <w:t>.</w:t>
-            </w:r>
-            <w:r>
-              <w:rPr>
-                <w:rFonts w:cs="BRH Malayalam Extra"/>
-                <w:szCs w:val="40"/>
-              </w:rPr>
-              <w:t>5</w:t>
-            </w:r>
-            <w:r>
-              <w:rPr>
-                <w:rFonts w:ascii="BRH Malayalam Extra" w:hAnsi="BRH Malayalam Extra" w:cs="BRH Malayalam Extra"/>
-                <w:sz w:val="32"/>
-                <w:szCs w:val="40"/>
-              </w:rPr>
-              <w:t>.</w:t>
-            </w:r>
-            <w:r>
-              <w:rPr>
-                <w:rFonts w:cs="BRH Malayalam Extra"/>
-                <w:szCs w:val="40"/>
-              </w:rPr>
-              <w:t>5</w:t>
-            </w:r>
-            <w:r>
-              <w:rPr>
-                <w:rFonts w:ascii="BRH Malayalam Extra" w:hAnsi="BRH Malayalam Extra" w:cs="BRH Malayalam Extra"/>
-                <w:sz w:val="32"/>
-                <w:szCs w:val="40"/>
-              </w:rPr>
-              <w:t>.</w:t>
-            </w:r>
-            <w:r>
-              <w:rPr>
-                <w:rFonts w:cs="BRH Malayalam Extra"/>
-                <w:szCs w:val="40"/>
-              </w:rPr>
-              <w:t>3</w:t>
-            </w:r>
-            <w:r>
-              <w:rPr>
-                <w:rFonts w:ascii="BRH Malayalam Extra" w:hAnsi="BRH Malayalam Extra" w:cs="BRH Malayalam Extra"/>
-                <w:sz w:val="32"/>
-                <w:szCs w:val="40"/>
-              </w:rPr>
-              <w:t>(</w:t>
-            </w:r>
-            <w:r>
-              <w:rPr>
-                <w:rFonts w:cs="BRH Malayalam Extra"/>
-                <w:szCs w:val="40"/>
-              </w:rPr>
-              <w:t>15</w:t>
-            </w:r>
-            <w:r>
-              <w:rPr>
-                <w:rFonts w:ascii="BRH Malayalam Extra" w:hAnsi="BRH Malayalam Extra" w:cs="BRH Malayalam Extra"/>
-                <w:sz w:val="32"/>
-                <w:szCs w:val="40"/>
-              </w:rPr>
-              <w:t>)-  ex</w:t>
-            </w:r>
-            <w:r>
-              <w:rPr>
-                <w:rFonts w:ascii="BRH Malayalam Extra" w:hAnsi="BRH Malayalam Extra" w:cs="BRH Malayalam Extra"/>
-                <w:sz w:val="26"/>
-                <w:szCs w:val="40"/>
-              </w:rPr>
-              <w:t>–</w:t>
-            </w:r>
-            <w:r>
-              <w:rPr>
-                <w:rFonts w:ascii="BRH Malayalam Extra" w:hAnsi="BRH Malayalam Extra" w:cs="BRH Malayalam Extra"/>
-                <w:sz w:val="32"/>
-                <w:szCs w:val="40"/>
-              </w:rPr>
-              <w:t>p</w:t>
-            </w:r>
-            <w:r>
-              <w:rPr>
-                <w:rFonts w:ascii="BRH Malayalam Extra" w:hAnsi="BRH Malayalam Extra" w:cs="BRH Malayalam Extra"/>
-                <w:sz w:val="26"/>
-                <w:szCs w:val="40"/>
-              </w:rPr>
-              <w:t>–</w:t>
-            </w:r>
-            <w:r>
-              <w:rPr>
-                <w:rFonts w:ascii="BRH Malayalam Extra" w:hAnsi="BRH Malayalam Extra" w:cs="BRH Malayalam Extra"/>
-                <w:sz w:val="32"/>
-                <w:szCs w:val="40"/>
-              </w:rPr>
-              <w:t>K</w:t>
-            </w:r>
-            <w:r>
-              <w:rPr>
-                <w:rFonts w:ascii="BRH Malayalam Extra" w:hAnsi="BRH Malayalam Extra" w:cs="BRH Malayalam Extra"/>
-                <w:sz w:val="26"/>
-                <w:szCs w:val="40"/>
-              </w:rPr>
-              <w:t>–</w:t>
-            </w:r>
-            <w:r>
-              <w:rPr>
-                <w:rFonts w:ascii="BRH Malayalam Extra" w:hAnsi="BRH Malayalam Extra" w:cs="BRH Malayalam Extra"/>
-                <w:sz w:val="32"/>
-                <w:szCs w:val="40"/>
-              </w:rPr>
-              <w:t xml:space="preserve"> | bz</w:t>
-            </w:r>
-            <w:r>
-              <w:rPr>
-                <w:rFonts w:ascii="BRH Malayalam Extra" w:hAnsi="BRH Malayalam Extra" w:cs="BRH Malayalam Extra"/>
-                <w:sz w:val="26"/>
-                <w:szCs w:val="40"/>
-              </w:rPr>
-              <w:t>–</w:t>
-            </w:r>
-            <w:r>
-              <w:rPr>
-                <w:rFonts w:ascii="BRH Malayalam Extra" w:hAnsi="BRH Malayalam Extra" w:cs="BRH Malayalam Extra"/>
-                <w:sz w:val="32"/>
-                <w:szCs w:val="40"/>
-              </w:rPr>
-              <w:t>by</w:t>
-            </w:r>
-            <w:r>
-              <w:rPr>
-                <w:rFonts w:ascii="BRH Malayalam Extra" w:hAnsi="BRH Malayalam Extra" w:cs="BRH Malayalam Extra"/>
-                <w:sz w:val="26"/>
-                <w:szCs w:val="40"/>
-              </w:rPr>
-              <w:t>–</w:t>
-            </w:r>
-            <w:r>
-              <w:rPr>
-                <w:rFonts w:ascii="BRH Malayalam Extra" w:hAnsi="BRH Malayalam Extra" w:cs="BRH Malayalam Extra"/>
-                <w:sz w:val="32"/>
-                <w:szCs w:val="40"/>
-              </w:rPr>
-              <w:t>pJ | A¥²˜ |</w:t>
-            </w:r>
-          </w:p>
-          <w:p>
-            <w:pPr>
-              <w:widowControl w:val="0"/>
-              <w:autoSpaceDE w:val="0"/>
-              <w:autoSpaceDN w:val="0"/>
-              <w:adjustRightInd w:val="0"/>
-              <w:spacing w:before="0" w:line="240" w:lineRule="auto"/>
-              <w:rPr>
-                <w:rFonts w:ascii="BRH Malayalam Extra" w:hAnsi="BRH Malayalam Extra" w:cs="BRH Malayalam Extra"/>
-                <w:sz w:val="32"/>
-                <w:szCs w:val="40"/>
-              </w:rPr>
-            </w:pPr>
-            <w:r>
-              <w:rPr>
-                <w:rFonts w:ascii="BRH Malayalam Extra" w:hAnsi="BRH Malayalam Extra" w:cs="BRH Malayalam Extra"/>
-                <w:sz w:val="32"/>
-                <w:szCs w:val="40"/>
-              </w:rPr>
-              <w:t>ex</w:t>
-            </w:r>
-            <w:r>
-              <w:rPr>
-                <w:rFonts w:ascii="BRH Malayalam Extra" w:hAnsi="BRH Malayalam Extra" w:cs="BRH Malayalam Extra"/>
-                <w:sz w:val="26"/>
-                <w:szCs w:val="40"/>
-              </w:rPr>
-              <w:t>–</w:t>
-            </w:r>
-            <w:r>
-              <w:rPr>
-                <w:rFonts w:ascii="BRH Malayalam Extra" w:hAnsi="BRH Malayalam Extra" w:cs="BRH Malayalam Extra"/>
-                <w:sz w:val="32"/>
-                <w:szCs w:val="40"/>
-              </w:rPr>
-              <w:t>p</w:t>
-            </w:r>
-            <w:r>
-              <w:rPr>
-                <w:rFonts w:ascii="BRH Malayalam Extra" w:hAnsi="BRH Malayalam Extra" w:cs="BRH Malayalam Extra"/>
-                <w:sz w:val="26"/>
-                <w:szCs w:val="40"/>
-              </w:rPr>
-              <w:t>–</w:t>
-            </w:r>
-            <w:r>
-              <w:rPr>
-                <w:rFonts w:ascii="BRH Malayalam Extra" w:hAnsi="BRH Malayalam Extra" w:cs="BRH Malayalam Extra"/>
-                <w:sz w:val="32"/>
-                <w:szCs w:val="40"/>
-              </w:rPr>
-              <w:t>K</w:t>
-            </w:r>
-            <w:r>
-              <w:rPr>
-                <w:rFonts w:ascii="BRH Malayalam Extra" w:hAnsi="BRH Malayalam Extra" w:cs="BRH Malayalam Extra"/>
-                <w:sz w:val="26"/>
-                <w:szCs w:val="40"/>
-              </w:rPr>
-              <w:t>–</w:t>
-            </w:r>
-            <w:r>
-              <w:rPr>
-                <w:rFonts w:ascii="BRH Malayalam Extra" w:hAnsi="BRH Malayalam Extra" w:cs="BRH Malayalam Extra"/>
-                <w:sz w:val="32"/>
-                <w:szCs w:val="40"/>
-              </w:rPr>
-              <w:t xml:space="preserve"> bz</w:t>
-            </w:r>
-            <w:r>
-              <w:rPr>
-                <w:rFonts w:ascii="BRH Malayalam Extra" w:hAnsi="BRH Malayalam Extra" w:cs="BRH Malayalam Extra"/>
-                <w:sz w:val="26"/>
-                <w:szCs w:val="40"/>
-              </w:rPr>
-              <w:t>–</w:t>
-            </w:r>
-            <w:r>
-              <w:rPr>
-                <w:rFonts w:ascii="BRH Malayalam Extra" w:hAnsi="BRH Malayalam Extra" w:cs="BRH Malayalam Extra"/>
-                <w:sz w:val="32"/>
-                <w:szCs w:val="40"/>
-              </w:rPr>
-              <w:t>by</w:t>
-            </w:r>
-            <w:r>
-              <w:rPr>
-                <w:rFonts w:ascii="BRH Malayalam Extra" w:hAnsi="BRH Malayalam Extra" w:cs="BRH Malayalam Extra"/>
-                <w:sz w:val="26"/>
-                <w:szCs w:val="40"/>
-              </w:rPr>
-              <w:t>–</w:t>
-            </w:r>
-            <w:r>
-              <w:rPr>
-                <w:rFonts w:ascii="BRH Malayalam Extra" w:hAnsi="BRH Malayalam Extra" w:cs="BRH Malayalam Extra"/>
-                <w:sz w:val="32"/>
-                <w:szCs w:val="40"/>
-              </w:rPr>
-              <w:t>¥</w:t>
-            </w:r>
-            <w:r>
-              <w:rPr>
-                <w:rFonts w:ascii="BRH Malayalam Extra" w:hAnsi="BRH Malayalam Extra" w:cs="BRH Malayalam Extra"/>
-                <w:sz w:val="32"/>
-                <w:szCs w:val="40"/>
-                <w:highlight w:val="yellow"/>
-              </w:rPr>
-              <w:t>p</w:t>
-            </w:r>
-            <w:r>
-              <w:rPr>
-                <w:rFonts w:ascii="BRH Malayalam Extra" w:hAnsi="BRH Malayalam Extra" w:cs="BRH Malayalam Extra"/>
-                <w:sz w:val="32"/>
-                <w:szCs w:val="40"/>
-              </w:rPr>
-              <w:t xml:space="preserve">x </w:t>
-            </w:r>
-            <w:r>
-              <w:rPr>
-                <w:rFonts w:ascii="BRH Malayalam Extra" w:hAnsi="BRH Malayalam Extra" w:cs="BRH Malayalam Extra"/>
-                <w:sz w:val="32"/>
-                <w:szCs w:val="40"/>
-                <w:highlight w:val="yellow"/>
-              </w:rPr>
-              <w:t>bz</w:t>
-            </w:r>
-            <w:r>
-              <w:rPr>
-                <w:rFonts w:ascii="BRH Malayalam Extra" w:hAnsi="BRH Malayalam Extra" w:cs="BRH Malayalam Extra"/>
-                <w:sz w:val="32"/>
-                <w:szCs w:val="40"/>
-              </w:rPr>
-              <w:t>—by</w:t>
-            </w:r>
-            <w:r>
-              <w:rPr>
-                <w:rFonts w:ascii="BRH Malayalam Extra" w:hAnsi="BRH Malayalam Extra" w:cs="BRH Malayalam Extra"/>
-                <w:sz w:val="26"/>
-                <w:szCs w:val="40"/>
-              </w:rPr>
-              <w:t>–</w:t>
-            </w:r>
-            <w:r>
-              <w:rPr>
-                <w:rFonts w:ascii="BRH Malayalam Extra" w:hAnsi="BRH Malayalam Extra" w:cs="BRH Malayalam Extra"/>
-                <w:sz w:val="32"/>
-                <w:szCs w:val="40"/>
-                <w:highlight w:val="yellow"/>
-              </w:rPr>
-              <w:t>p</w:t>
-            </w:r>
-            <w:r>
-              <w:rPr>
-                <w:rFonts w:ascii="BRH Malayalam Extra" w:hAnsi="BRH Malayalam Extra" w:cs="BRH Malayalam Extra"/>
-                <w:sz w:val="32"/>
-                <w:szCs w:val="40"/>
-              </w:rPr>
-              <w:t xml:space="preserve">J </w:t>
-            </w:r>
-            <w:r>
-              <w:rPr>
-                <w:rFonts w:ascii="BRH Malayalam Extra" w:hAnsi="BRH Malayalam Extra" w:cs="BRH Malayalam Extra"/>
-                <w:sz w:val="32"/>
-                <w:szCs w:val="40"/>
-                <w:highlight w:val="yellow"/>
-              </w:rPr>
-              <w:t>ex—pK expK</w:t>
-            </w:r>
-            <w:r>
-              <w:rPr>
-                <w:rFonts w:ascii="BRH Malayalam Extra" w:hAnsi="BRH Malayalam Extra" w:cs="BRH Malayalam Extra"/>
-                <w:sz w:val="32"/>
-                <w:szCs w:val="40"/>
-              </w:rPr>
-              <w:t xml:space="preserve"> </w:t>
-            </w:r>
-            <w:r>
-              <w:rPr>
-                <w:rFonts w:ascii="BRH Malayalam Extra" w:hAnsi="BRH Malayalam Extra" w:cs="BRH Malayalam Extra"/>
-                <w:sz w:val="32"/>
-                <w:szCs w:val="40"/>
-                <w:highlight w:val="yellow"/>
-              </w:rPr>
-              <w:t>b</w:t>
-            </w:r>
-            <w:r>
-              <w:rPr>
-                <w:rFonts w:ascii="BRH Malayalam Extra" w:hAnsi="BRH Malayalam Extra" w:cs="BRH Malayalam Extra"/>
-                <w:sz w:val="32"/>
-                <w:szCs w:val="40"/>
-              </w:rPr>
-              <w:t>zby</w:t>
-            </w:r>
-            <w:r>
-              <w:rPr>
-                <w:rFonts w:ascii="BRH Malayalam Extra" w:hAnsi="BRH Malayalam Extra" w:cs="BRH Malayalam Extra"/>
-                <w:sz w:val="26"/>
-                <w:szCs w:val="40"/>
-              </w:rPr>
-              <w:t>–</w:t>
-            </w:r>
-            <w:r>
-              <w:rPr>
-                <w:rFonts w:ascii="BRH Malayalam Extra" w:hAnsi="BRH Malayalam Extra" w:cs="BRH Malayalam Extra"/>
-                <w:sz w:val="32"/>
-                <w:szCs w:val="40"/>
-              </w:rPr>
-              <w:t xml:space="preserve">¥px </w:t>
-            </w:r>
-          </w:p>
-          <w:p>
-            <w:pPr>
-              <w:widowControl w:val="0"/>
-              <w:autoSpaceDE w:val="0"/>
-              <w:autoSpaceDN w:val="0"/>
-              <w:adjustRightInd w:val="0"/>
-              <w:spacing w:before="0" w:line="240" w:lineRule="auto"/>
-              <w:rPr>
-                <w:rFonts w:ascii="BRH Malayalam Extra" w:hAnsi="BRH Malayalam Extra" w:cs="BRH Malayalam Extra"/>
-                <w:sz w:val="32"/>
-                <w:szCs w:val="40"/>
-              </w:rPr>
-            </w:pPr>
-            <w:r>
-              <w:rPr>
-                <w:rFonts w:ascii="BRH Malayalam Extra" w:hAnsi="BRH Malayalam Extra" w:cs="BRH Malayalam Extra"/>
-                <w:sz w:val="32"/>
-                <w:szCs w:val="40"/>
-              </w:rPr>
+                <w:rFonts w:ascii="BRH Malayalam Extra" w:hAnsi="BRH Malayalam Extra" w:cs="BRH Malayalam Extra"/>
+                <w:sz w:val="32"/>
+                <w:szCs w:val="40"/>
+              </w:rPr>
+              <w:lastRenderedPageBreak/>
               <w:t>„¥² „¥²— bz</w:t>
             </w:r>
             <w:r>
@@ -24966,7 +24927,6 @@
                 <w:highlight w:val="green"/>
                 <w:lang w:val="it-IT"/>
               </w:rPr>
-              <w:lastRenderedPageBreak/>
               <w:t>ex</w:t>
             </w:r>
             <w:r>
@@ -25219,6 +25179,218 @@
                 <w:lang w:val="it-IT"/>
               </w:rPr>
             </w:pPr>
+            <w:r>
+              <w:rPr>
+                <w:rFonts w:cs="BRH Malayalam Extra"/>
+                <w:szCs w:val="40"/>
+                <w:lang w:val="it-IT"/>
+              </w:rPr>
+              <w:t>15</w:t>
+            </w:r>
+            <w:r>
+              <w:rPr>
+                <w:rFonts w:ascii="BRH Malayalam Extra" w:hAnsi="BRH Malayalam Extra" w:cs="BRH Malayalam Extra"/>
+                <w:sz w:val="32"/>
+                <w:szCs w:val="40"/>
+                <w:lang w:val="it-IT"/>
+              </w:rPr>
+              <w:t>)</w:t>
+            </w:r>
+            <w:r>
+              <w:rPr>
+                <w:rFonts w:cs="BRH Malayalam Extra"/>
+                <w:szCs w:val="40"/>
+                <w:lang w:val="it-IT"/>
+              </w:rPr>
+              <w:t xml:space="preserve">  1</w:t>
+            </w:r>
+            <w:r>
+              <w:rPr>
+                <w:rFonts w:ascii="BRH Malayalam Extra" w:hAnsi="BRH Malayalam Extra" w:cs="BRH Malayalam Extra"/>
+                <w:sz w:val="32"/>
+                <w:szCs w:val="40"/>
+                <w:lang w:val="it-IT"/>
+              </w:rPr>
+              <w:t>.</w:t>
+            </w:r>
+            <w:r>
+              <w:rPr>
+                <w:rFonts w:cs="BRH Malayalam Extra"/>
+                <w:szCs w:val="40"/>
+                <w:lang w:val="it-IT"/>
+              </w:rPr>
+              <w:t>5</w:t>
+            </w:r>
+            <w:r>
+              <w:rPr>
+                <w:rFonts w:ascii="BRH Malayalam Extra" w:hAnsi="BRH Malayalam Extra" w:cs="BRH Malayalam Extra"/>
+                <w:sz w:val="32"/>
+                <w:szCs w:val="40"/>
+                <w:lang w:val="it-IT"/>
+              </w:rPr>
+              <w:t>.</w:t>
+            </w:r>
+            <w:r>
+              <w:rPr>
+                <w:rFonts w:cs="BRH Malayalam Extra"/>
+                <w:szCs w:val="40"/>
+                <w:lang w:val="it-IT"/>
+              </w:rPr>
+              <w:t>5</w:t>
+            </w:r>
+            <w:r>
+              <w:rPr>
+                <w:rFonts w:ascii="BRH Malayalam Extra" w:hAnsi="BRH Malayalam Extra" w:cs="BRH Malayalam Extra"/>
+                <w:sz w:val="32"/>
+                <w:szCs w:val="40"/>
+                <w:lang w:val="it-IT"/>
+              </w:rPr>
+              <w:t>.</w:t>
+            </w:r>
+            <w:r>
+              <w:rPr>
+                <w:rFonts w:cs="BRH Malayalam Extra"/>
+                <w:szCs w:val="40"/>
+                <w:lang w:val="it-IT"/>
+              </w:rPr>
+              <w:t>3</w:t>
+            </w:r>
+            <w:r>
+              <w:rPr>
+                <w:rFonts w:ascii="BRH Malayalam Extra" w:hAnsi="BRH Malayalam Extra" w:cs="BRH Malayalam Extra"/>
+                <w:sz w:val="32"/>
+                <w:szCs w:val="40"/>
+                <w:lang w:val="it-IT"/>
+              </w:rPr>
+              <w:t>(</w:t>
+            </w:r>
+            <w:r>
+              <w:rPr>
+                <w:rFonts w:cs="BRH Malayalam Extra"/>
+                <w:szCs w:val="40"/>
+                <w:lang w:val="it-IT"/>
+              </w:rPr>
+              <w:t>15</w:t>
+            </w:r>
+            <w:r>
+              <w:rPr>
+                <w:rFonts w:ascii="BRH Malayalam Extra" w:hAnsi="BRH Malayalam Extra" w:cs="BRH Malayalam Extra"/>
+                <w:sz w:val="32"/>
+                <w:szCs w:val="40"/>
+                <w:lang w:val="it-IT"/>
+              </w:rPr>
+              <w:t>)-  ex</w:t>
+            </w:r>
+            <w:r>
+              <w:rPr>
+                <w:rFonts w:ascii="BRH Malayalam Extra" w:hAnsi="BRH Malayalam Extra" w:cs="BRH Malayalam Extra"/>
+                <w:sz w:val="26"/>
+                <w:szCs w:val="40"/>
+                <w:lang w:val="it-IT"/>
+              </w:rPr>
+              <w:t>–</w:t>
+            </w:r>
+            <w:r>
+              <w:rPr>
+                <w:rFonts w:ascii="BRH Malayalam Extra" w:hAnsi="BRH Malayalam Extra" w:cs="BRH Malayalam Extra"/>
+                <w:sz w:val="32"/>
+                <w:szCs w:val="40"/>
+                <w:lang w:val="it-IT"/>
+              </w:rPr>
+              <w:t>p</w:t>
+            </w:r>
+            <w:r>
+              <w:rPr>
+                <w:rFonts w:ascii="BRH Malayalam Extra" w:hAnsi="BRH Malayalam Extra" w:cs="BRH Malayalam Extra"/>
+                <w:sz w:val="26"/>
+                <w:szCs w:val="40"/>
+                <w:lang w:val="it-IT"/>
+              </w:rPr>
+              <w:t>–</w:t>
+            </w:r>
+            <w:r>
+              <w:rPr>
+                <w:rFonts w:ascii="BRH Malayalam Extra" w:hAnsi="BRH Malayalam Extra" w:cs="BRH Malayalam Extra"/>
+                <w:sz w:val="32"/>
+                <w:szCs w:val="40"/>
+                <w:lang w:val="it-IT"/>
+              </w:rPr>
+              <w:t>K</w:t>
+            </w:r>
+            <w:r>
+              <w:rPr>
+                <w:rFonts w:ascii="BRH Malayalam Extra" w:hAnsi="BRH Malayalam Extra" w:cs="BRH Malayalam Extra"/>
+                <w:sz w:val="26"/>
+                <w:szCs w:val="40"/>
+                <w:lang w:val="it-IT"/>
+              </w:rPr>
+              <w:t>–</w:t>
+            </w:r>
+            <w:r>
+              <w:rPr>
+                <w:rFonts w:ascii="BRH Malayalam Extra" w:hAnsi="BRH Malayalam Extra" w:cs="BRH Malayalam Extra"/>
+                <w:sz w:val="32"/>
+                <w:szCs w:val="40"/>
+                <w:lang w:val="it-IT"/>
+              </w:rPr>
+              <w:t xml:space="preserve"> | bz</w:t>
+            </w:r>
+            <w:r>
+              <w:rPr>
+                <w:rFonts w:ascii="BRH Malayalam Extra" w:hAnsi="BRH Malayalam Extra" w:cs="BRH Malayalam Extra"/>
+                <w:sz w:val="26"/>
+                <w:szCs w:val="40"/>
+                <w:lang w:val="it-IT"/>
+              </w:rPr>
+              <w:t>–</w:t>
+            </w:r>
+            <w:r>
+              <w:rPr>
+                <w:rFonts w:ascii="BRH Malayalam Extra" w:hAnsi="BRH Malayalam Extra" w:cs="BRH Malayalam Extra"/>
+                <w:sz w:val="32"/>
+                <w:szCs w:val="40"/>
+                <w:lang w:val="it-IT"/>
+              </w:rPr>
+              <w:t>by</w:t>
+            </w:r>
+            <w:r>
+              <w:rPr>
+                <w:rFonts w:ascii="BRH Malayalam Extra" w:hAnsi="BRH Malayalam Extra" w:cs="BRH Malayalam Extra"/>
+                <w:sz w:val="26"/>
+                <w:szCs w:val="40"/>
+                <w:lang w:val="it-IT"/>
+              </w:rPr>
+              <w:t>–</w:t>
+            </w:r>
+            <w:r>
+              <w:rPr>
+                <w:rFonts w:ascii="BRH Malayalam Extra" w:hAnsi="BRH Malayalam Extra" w:cs="BRH Malayalam Extra"/>
+                <w:sz w:val="32"/>
+                <w:szCs w:val="40"/>
+                <w:highlight w:val="green"/>
+                <w:lang w:val="it-IT"/>
+              </w:rPr>
+              <w:t>p</w:t>
+            </w:r>
+            <w:r>
+              <w:rPr>
+                <w:rFonts w:ascii="BRH Malayalam Extra" w:hAnsi="BRH Malayalam Extra" w:cs="BRH Malayalam Extra"/>
+                <w:sz w:val="26"/>
+                <w:szCs w:val="40"/>
+                <w:highlight w:val="green"/>
+                <w:lang w:val="it-IT"/>
+              </w:rPr>
+              <w:t>–</w:t>
+            </w:r>
+            <w:r>
+              <w:rPr>
+                <w:rFonts w:ascii="BRH Malayalam Extra" w:hAnsi="BRH Malayalam Extra" w:cs="BRH Malayalam Extra"/>
+                <w:sz w:val="32"/>
+                <w:szCs w:val="40"/>
+                <w:lang w:val="it-IT"/>
+              </w:rPr>
+              <w:t>J | A¥²˜ |</w:t>
+            </w:r>
           </w:p>
           <w:p>
             <w:pPr>
@@ -25234,6 +25406,378 @@
                 <w:lang w:val="it-IT"/>
               </w:rPr>
             </w:pPr>
+            <w:r>
+              <w:rPr>
+                <w:rFonts w:ascii="BRH Malayalam Extra" w:hAnsi="BRH Malayalam Extra" w:cs="BRH Malayalam Extra"/>
+                <w:sz w:val="32"/>
+                <w:szCs w:val="40"/>
+                <w:lang w:val="it-IT"/>
+              </w:rPr>
+              <w:t>ex</w:t>
+            </w:r>
+            <w:r>
+              <w:rPr>
+                <w:rFonts w:ascii="BRH Malayalam Extra" w:hAnsi="BRH Malayalam Extra" w:cs="BRH Malayalam Extra"/>
+                <w:sz w:val="26"/>
+                <w:szCs w:val="40"/>
+                <w:lang w:val="it-IT"/>
+              </w:rPr>
+              <w:t>–</w:t>
+            </w:r>
+            <w:r>
+              <w:rPr>
+                <w:rFonts w:ascii="BRH Malayalam Extra" w:hAnsi="BRH Malayalam Extra" w:cs="BRH Malayalam Extra"/>
+                <w:sz w:val="32"/>
+                <w:szCs w:val="40"/>
+                <w:lang w:val="it-IT"/>
+              </w:rPr>
+              <w:t>p</w:t>
+            </w:r>
+            <w:r>
+              <w:rPr>
+                <w:rFonts w:ascii="BRH Malayalam Extra" w:hAnsi="BRH Malayalam Extra" w:cs="BRH Malayalam Extra"/>
+                <w:sz w:val="26"/>
+                <w:szCs w:val="40"/>
+                <w:lang w:val="it-IT"/>
+              </w:rPr>
+              <w:t>–</w:t>
+            </w:r>
+            <w:r>
+              <w:rPr>
+                <w:rFonts w:ascii="BRH Malayalam Extra" w:hAnsi="BRH Malayalam Extra" w:cs="BRH Malayalam Extra"/>
+                <w:sz w:val="32"/>
+                <w:szCs w:val="40"/>
+                <w:lang w:val="it-IT"/>
+              </w:rPr>
+              <w:t>K</w:t>
+            </w:r>
+            <w:r>
+              <w:rPr>
+                <w:rFonts w:ascii="BRH Malayalam Extra" w:hAnsi="BRH Malayalam Extra" w:cs="BRH Malayalam Extra"/>
+                <w:sz w:val="26"/>
+                <w:szCs w:val="40"/>
+                <w:lang w:val="it-IT"/>
+              </w:rPr>
+              <w:t>–</w:t>
+            </w:r>
+            <w:r>
+              <w:rPr>
+                <w:rFonts w:ascii="BRH Malayalam Extra" w:hAnsi="BRH Malayalam Extra" w:cs="BRH Malayalam Extra"/>
+                <w:sz w:val="32"/>
+                <w:szCs w:val="40"/>
+                <w:lang w:val="it-IT"/>
+              </w:rPr>
+              <w:t xml:space="preserve"> bz</w:t>
+            </w:r>
+            <w:r>
+              <w:rPr>
+                <w:rFonts w:ascii="BRH Malayalam Extra" w:hAnsi="BRH Malayalam Extra" w:cs="BRH Malayalam Extra"/>
+                <w:sz w:val="26"/>
+                <w:szCs w:val="40"/>
+                <w:lang w:val="it-IT"/>
+              </w:rPr>
+              <w:t>–</w:t>
+            </w:r>
+            <w:r>
+              <w:rPr>
+                <w:rFonts w:ascii="BRH Malayalam Extra" w:hAnsi="BRH Malayalam Extra" w:cs="BRH Malayalam Extra"/>
+                <w:sz w:val="32"/>
+                <w:szCs w:val="40"/>
+                <w:lang w:val="it-IT"/>
+              </w:rPr>
+              <w:t>by</w:t>
+            </w:r>
+            <w:r>
+              <w:rPr>
+                <w:rFonts w:ascii="BRH Malayalam Extra" w:hAnsi="BRH Malayalam Extra" w:cs="BRH Malayalam Extra"/>
+                <w:sz w:val="26"/>
+                <w:szCs w:val="40"/>
+                <w:lang w:val="it-IT"/>
+              </w:rPr>
+              <w:t>–</w:t>
+            </w:r>
+            <w:r>
+              <w:rPr>
+                <w:rFonts w:ascii="BRH Malayalam Extra" w:hAnsi="BRH Malayalam Extra" w:cs="BRH Malayalam Extra"/>
+                <w:sz w:val="32"/>
+                <w:szCs w:val="40"/>
+                <w:lang w:val="it-IT"/>
+              </w:rPr>
+              <w:t>¥</w:t>
+            </w:r>
+            <w:r>
+              <w:rPr>
+                <w:rFonts w:ascii="BRH Malayalam Extra" w:hAnsi="BRH Malayalam Extra" w:cs="BRH Malayalam Extra"/>
+                <w:sz w:val="32"/>
+                <w:szCs w:val="40"/>
+                <w:highlight w:val="green"/>
+                <w:lang w:val="it-IT"/>
+              </w:rPr>
+              <w:t>p</w:t>
+            </w:r>
+            <w:r>
+              <w:rPr>
+                <w:rFonts w:ascii="BRH Malayalam Extra" w:hAnsi="BRH Malayalam Extra" w:cs="BRH Malayalam Extra"/>
+                <w:sz w:val="26"/>
+                <w:szCs w:val="40"/>
+                <w:highlight w:val="green"/>
+                <w:lang w:val="it-IT"/>
+              </w:rPr>
+              <w:t>–</w:t>
+            </w:r>
+            <w:r>
+              <w:rPr>
+                <w:rFonts w:ascii="BRH Malayalam Extra" w:hAnsi="BRH Malayalam Extra" w:cs="BRH Malayalam Extra"/>
+                <w:sz w:val="32"/>
+                <w:szCs w:val="40"/>
+                <w:lang w:val="it-IT"/>
+              </w:rPr>
+              <w:t xml:space="preserve">x </w:t>
+            </w:r>
+            <w:r>
+              <w:rPr>
+                <w:rFonts w:ascii="BRH Malayalam Extra" w:hAnsi="BRH Malayalam Extra" w:cs="BRH Malayalam Extra"/>
+                <w:sz w:val="32"/>
+                <w:szCs w:val="40"/>
+                <w:highlight w:val="green"/>
+                <w:lang w:val="it-IT"/>
+              </w:rPr>
+              <w:t>bz</w:t>
+            </w:r>
+            <w:r>
+              <w:rPr>
+                <w:rFonts w:ascii="BRH Malayalam Extra" w:hAnsi="BRH Malayalam Extra" w:cs="BRH Malayalam Extra"/>
+                <w:sz w:val="26"/>
+                <w:szCs w:val="40"/>
+                <w:lang w:val="it-IT"/>
+              </w:rPr>
+              <w:t>–</w:t>
+            </w:r>
+            <w:r>
+              <w:rPr>
+                <w:rFonts w:ascii="BRH Malayalam Extra" w:hAnsi="BRH Malayalam Extra" w:cs="BRH Malayalam Extra"/>
+                <w:sz w:val="32"/>
+                <w:szCs w:val="40"/>
+                <w:lang w:val="it-IT"/>
+              </w:rPr>
+              <w:t>by</w:t>
+            </w:r>
+            <w:r>
+              <w:rPr>
+                <w:rFonts w:ascii="BRH Malayalam Extra" w:hAnsi="BRH Malayalam Extra" w:cs="BRH Malayalam Extra"/>
+                <w:sz w:val="26"/>
+                <w:szCs w:val="40"/>
+                <w:lang w:val="it-IT"/>
+              </w:rPr>
+              <w:t>–</w:t>
+            </w:r>
+            <w:r>
+              <w:rPr>
+                <w:rFonts w:ascii="BRH Malayalam Extra" w:hAnsi="BRH Malayalam Extra" w:cs="BRH Malayalam Extra"/>
+                <w:sz w:val="32"/>
+                <w:szCs w:val="40"/>
+                <w:highlight w:val="green"/>
+                <w:lang w:val="it-IT"/>
+              </w:rPr>
+              <w:t>p</w:t>
+            </w:r>
+            <w:r>
+              <w:rPr>
+                <w:rFonts w:ascii="BRH Malayalam Extra" w:hAnsi="BRH Malayalam Extra" w:cs="BRH Malayalam Extra"/>
+                <w:sz w:val="26"/>
+                <w:szCs w:val="40"/>
+                <w:lang w:val="it-IT"/>
+              </w:rPr>
+              <w:t>–</w:t>
+            </w:r>
+            <w:r>
+              <w:rPr>
+                <w:rFonts w:ascii="BRH Malayalam Extra" w:hAnsi="BRH Malayalam Extra" w:cs="BRH Malayalam Extra"/>
+                <w:sz w:val="32"/>
+                <w:szCs w:val="40"/>
+                <w:lang w:val="it-IT"/>
+              </w:rPr>
+              <w:t xml:space="preserve">J </w:t>
+            </w:r>
+            <w:r>
+              <w:rPr>
+                <w:rFonts w:ascii="BRH Malayalam Extra" w:hAnsi="BRH Malayalam Extra" w:cs="BRH Malayalam Extra"/>
+                <w:sz w:val="32"/>
+                <w:szCs w:val="40"/>
+                <w:highlight w:val="green"/>
+                <w:lang w:val="it-IT"/>
+              </w:rPr>
+              <w:t>ex</w:t>
+            </w:r>
+            <w:r>
+              <w:rPr>
+                <w:rFonts w:ascii="BRH Malayalam Extra" w:hAnsi="BRH Malayalam Extra" w:cs="BRH Malayalam Extra"/>
+                <w:sz w:val="26"/>
+                <w:szCs w:val="40"/>
+                <w:lang w:val="it-IT"/>
+              </w:rPr>
+              <w:t>–</w:t>
+            </w:r>
+            <w:r>
+              <w:rPr>
+                <w:rFonts w:ascii="BRH Malayalam Extra" w:hAnsi="BRH Malayalam Extra" w:cs="BRH Malayalam Extra"/>
+                <w:sz w:val="32"/>
+                <w:szCs w:val="40"/>
+                <w:highlight w:val="green"/>
+                <w:lang w:val="it-IT"/>
+              </w:rPr>
+              <w:t>p</w:t>
+            </w:r>
+            <w:r>
+              <w:rPr>
+                <w:rFonts w:ascii="BRH Malayalam Extra" w:hAnsi="BRH Malayalam Extra" w:cs="BRH Malayalam Extra"/>
+                <w:sz w:val="26"/>
+                <w:szCs w:val="40"/>
+                <w:lang w:val="it-IT"/>
+              </w:rPr>
+              <w:t>–</w:t>
+            </w:r>
+            <w:r>
+              <w:rPr>
+                <w:rFonts w:ascii="BRH Malayalam Extra" w:hAnsi="BRH Malayalam Extra" w:cs="BRH Malayalam Extra"/>
+                <w:sz w:val="32"/>
+                <w:szCs w:val="40"/>
+                <w:highlight w:val="green"/>
+                <w:lang w:val="it-IT"/>
+              </w:rPr>
+              <w:t>K</w:t>
+            </w:r>
+            <w:r>
+              <w:rPr>
+                <w:rFonts w:ascii="BRH Malayalam Extra" w:hAnsi="BRH Malayalam Extra" w:cs="BRH Malayalam Extra"/>
+                <w:sz w:val="26"/>
+                <w:szCs w:val="40"/>
+                <w:lang w:val="it-IT"/>
+              </w:rPr>
+              <w:t>–</w:t>
+            </w:r>
+            <w:r>
+              <w:rPr>
+                <w:rFonts w:ascii="BRH Malayalam Extra" w:hAnsi="BRH Malayalam Extra" w:cs="BRH Malayalam Extra"/>
+                <w:sz w:val="32"/>
+                <w:szCs w:val="40"/>
+                <w:lang w:val="it-IT"/>
+              </w:rPr>
+              <w:t xml:space="preserve"> </w:t>
+            </w:r>
+            <w:r>
+              <w:rPr>
+                <w:rFonts w:ascii="BRH Malayalam Extra" w:hAnsi="BRH Malayalam Extra" w:cs="BRH Malayalam Extra"/>
+                <w:sz w:val="32"/>
+                <w:szCs w:val="40"/>
+                <w:highlight w:val="green"/>
+                <w:lang w:val="it-IT"/>
+              </w:rPr>
+              <w:t>ex</w:t>
+            </w:r>
+            <w:r>
+              <w:rPr>
+                <w:rFonts w:ascii="BRH Malayalam Extra" w:hAnsi="BRH Malayalam Extra" w:cs="BRH Malayalam Extra"/>
+                <w:sz w:val="26"/>
+                <w:szCs w:val="40"/>
+                <w:highlight w:val="green"/>
+                <w:lang w:val="it-IT"/>
+              </w:rPr>
+              <w:t>–</w:t>
+            </w:r>
+            <w:r>
+              <w:rPr>
+                <w:rFonts w:ascii="BRH Malayalam Extra" w:hAnsi="BRH Malayalam Extra" w:cs="BRH Malayalam Extra"/>
+                <w:sz w:val="32"/>
+                <w:szCs w:val="40"/>
+                <w:highlight w:val="green"/>
+                <w:lang w:val="it-IT"/>
+              </w:rPr>
+              <w:t>p</w:t>
+            </w:r>
+            <w:r>
+              <w:rPr>
+                <w:rFonts w:ascii="BRH Malayalam Extra" w:hAnsi="BRH Malayalam Extra" w:cs="BRH Malayalam Extra"/>
+                <w:sz w:val="26"/>
+                <w:szCs w:val="40"/>
+                <w:highlight w:val="green"/>
+                <w:lang w:val="it-IT"/>
+              </w:rPr>
+              <w:t>–</w:t>
+            </w:r>
+            <w:r>
+              <w:rPr>
+                <w:rFonts w:ascii="BRH Malayalam Extra" w:hAnsi="BRH Malayalam Extra" w:cs="BRH Malayalam Extra"/>
+                <w:sz w:val="32"/>
+                <w:szCs w:val="40"/>
+                <w:lang w:val="it-IT"/>
+              </w:rPr>
+              <w:t>K</w:t>
+            </w:r>
+            <w:r>
+              <w:rPr>
+                <w:rFonts w:ascii="BRH Malayalam Extra" w:hAnsi="BRH Malayalam Extra" w:cs="BRH Malayalam Extra"/>
+                <w:sz w:val="26"/>
+                <w:szCs w:val="40"/>
+                <w:lang w:val="it-IT"/>
+              </w:rPr>
+              <w:t>–</w:t>
+            </w:r>
+            <w:r>
+              <w:rPr>
+                <w:rFonts w:ascii="BRH Malayalam Extra" w:hAnsi="BRH Malayalam Extra" w:cs="BRH Malayalam Extra"/>
+                <w:sz w:val="32"/>
+                <w:szCs w:val="40"/>
+                <w:lang w:val="it-IT"/>
+              </w:rPr>
+              <w:t xml:space="preserve"> </w:t>
+            </w:r>
+            <w:r>
+              <w:rPr>
+                <w:rFonts w:ascii="BRH Malayalam Extra" w:hAnsi="BRH Malayalam Extra" w:cs="BRH Malayalam Extra"/>
+                <w:sz w:val="32"/>
+                <w:szCs w:val="40"/>
+                <w:highlight w:val="green"/>
+                <w:lang w:val="it-IT"/>
+              </w:rPr>
+              <w:t>bz</w:t>
+            </w:r>
+            <w:r>
+              <w:rPr>
+                <w:rFonts w:ascii="BRH Malayalam Extra" w:hAnsi="BRH Malayalam Extra" w:cs="BRH Malayalam Extra"/>
+                <w:sz w:val="26"/>
+                <w:szCs w:val="40"/>
+                <w:lang w:val="it-IT"/>
+              </w:rPr>
+              <w:t>–</w:t>
+            </w:r>
+            <w:r>
+              <w:rPr>
+                <w:rFonts w:ascii="BRH Malayalam Extra" w:hAnsi="BRH Malayalam Extra" w:cs="BRH Malayalam Extra"/>
+                <w:sz w:val="32"/>
+                <w:szCs w:val="40"/>
+                <w:lang w:val="it-IT"/>
+              </w:rPr>
+              <w:t>by</w:t>
+            </w:r>
+            <w:r>
+              <w:rPr>
+                <w:rFonts w:ascii="BRH Malayalam Extra" w:hAnsi="BRH Malayalam Extra" w:cs="BRH Malayalam Extra"/>
+                <w:sz w:val="26"/>
+                <w:szCs w:val="40"/>
+                <w:lang w:val="it-IT"/>
+              </w:rPr>
+              <w:t>–</w:t>
+            </w:r>
+            <w:r>
+              <w:rPr>
+                <w:rFonts w:ascii="BRH Malayalam Extra" w:hAnsi="BRH Malayalam Extra" w:cs="BRH Malayalam Extra"/>
+                <w:sz w:val="32"/>
+                <w:szCs w:val="40"/>
+                <w:lang w:val="it-IT"/>
+              </w:rPr>
+              <w:t xml:space="preserve">¥px </w:t>
+            </w:r>
           </w:p>
           <w:p>
             <w:pPr>
@@ -25251,625 +25795,12 @@
             </w:pPr>
             <w:r>
               <w:rPr>
-                <w:rFonts w:cs="BRH Malayalam Extra"/>
-                <w:szCs w:val="40"/>
-                <w:lang w:val="it-IT"/>
-              </w:rPr>
-              <w:t>15</w:t>
-            </w:r>
-            <w:r>
-              <w:rPr>
-                <w:rFonts w:ascii="BRH Malayalam Extra" w:hAnsi="BRH Malayalam Extra" w:cs="BRH Malayalam Extra"/>
-                <w:sz w:val="32"/>
-                <w:szCs w:val="40"/>
-                <w:lang w:val="it-IT"/>
-              </w:rPr>
-              <w:t>)</w:t>
-            </w:r>
-            <w:r>
-              <w:rPr>
-                <w:rFonts w:cs="BRH Malayalam Extra"/>
-                <w:szCs w:val="40"/>
-                <w:lang w:val="it-IT"/>
-              </w:rPr>
-              <w:t xml:space="preserve">  1</w:t>
-            </w:r>
-            <w:r>
-              <w:rPr>
-                <w:rFonts w:ascii="BRH Malayalam Extra" w:hAnsi="BRH Malayalam Extra" w:cs="BRH Malayalam Extra"/>
-                <w:sz w:val="32"/>
-                <w:szCs w:val="40"/>
-                <w:lang w:val="it-IT"/>
-              </w:rPr>
-              <w:t>.</w:t>
-            </w:r>
-            <w:r>
-              <w:rPr>
-                <w:rFonts w:cs="BRH Malayalam Extra"/>
-                <w:szCs w:val="40"/>
-                <w:lang w:val="it-IT"/>
-              </w:rPr>
-              <w:t>5</w:t>
-            </w:r>
-            <w:r>
-              <w:rPr>
-                <w:rFonts w:ascii="BRH Malayalam Extra" w:hAnsi="BRH Malayalam Extra" w:cs="BRH Malayalam Extra"/>
-                <w:sz w:val="32"/>
-                <w:szCs w:val="40"/>
-                <w:lang w:val="it-IT"/>
-              </w:rPr>
-              <w:t>.</w:t>
-            </w:r>
-            <w:r>
-              <w:rPr>
-                <w:rFonts w:cs="BRH Malayalam Extra"/>
-                <w:szCs w:val="40"/>
-                <w:lang w:val="it-IT"/>
-              </w:rPr>
-              <w:t>5</w:t>
-            </w:r>
-            <w:r>
-              <w:rPr>
-                <w:rFonts w:ascii="BRH Malayalam Extra" w:hAnsi="BRH Malayalam Extra" w:cs="BRH Malayalam Extra"/>
-                <w:sz w:val="32"/>
-                <w:szCs w:val="40"/>
-                <w:lang w:val="it-IT"/>
-              </w:rPr>
-              <w:t>.</w:t>
-            </w:r>
-            <w:r>
-              <w:rPr>
-                <w:rFonts w:cs="BRH Malayalam Extra"/>
-                <w:szCs w:val="40"/>
-                <w:lang w:val="it-IT"/>
-              </w:rPr>
-              <w:t>3</w:t>
-            </w:r>
-            <w:r>
-              <w:rPr>
-                <w:rFonts w:ascii="BRH Malayalam Extra" w:hAnsi="BRH Malayalam Extra" w:cs="BRH Malayalam Extra"/>
-                <w:sz w:val="32"/>
-                <w:szCs w:val="40"/>
-                <w:lang w:val="it-IT"/>
-              </w:rPr>
-              <w:t>(</w:t>
-            </w:r>
-            <w:r>
-              <w:rPr>
-                <w:rFonts w:cs="BRH Malayalam Extra"/>
-                <w:szCs w:val="40"/>
-                <w:lang w:val="it-IT"/>
-              </w:rPr>
-              <w:t>15</w:t>
-            </w:r>
-            <w:r>
-              <w:rPr>
-                <w:rFonts w:ascii="BRH Malayalam Extra" w:hAnsi="BRH Malayalam Extra" w:cs="BRH Malayalam Extra"/>
-                <w:sz w:val="32"/>
-                <w:szCs w:val="40"/>
-                <w:lang w:val="it-IT"/>
-              </w:rPr>
-              <w:t>)-  ex</w:t>
-            </w:r>
-            <w:r>
-              <w:rPr>
-                <w:rFonts w:ascii="BRH Malayalam Extra" w:hAnsi="BRH Malayalam Extra" w:cs="BRH Malayalam Extra"/>
-                <w:sz w:val="26"/>
-                <w:szCs w:val="40"/>
-                <w:lang w:val="it-IT"/>
-              </w:rPr>
-              <w:t>–</w:t>
-            </w:r>
-            <w:r>
-              <w:rPr>
-                <w:rFonts w:ascii="BRH Malayalam Extra" w:hAnsi="BRH Malayalam Extra" w:cs="BRH Malayalam Extra"/>
-                <w:sz w:val="32"/>
-                <w:szCs w:val="40"/>
-                <w:lang w:val="it-IT"/>
-              </w:rPr>
-              <w:t>p</w:t>
-            </w:r>
-            <w:r>
-              <w:rPr>
-                <w:rFonts w:ascii="BRH Malayalam Extra" w:hAnsi="BRH Malayalam Extra" w:cs="BRH Malayalam Extra"/>
-                <w:sz w:val="26"/>
-                <w:szCs w:val="40"/>
-                <w:lang w:val="it-IT"/>
-              </w:rPr>
-              <w:t>–</w:t>
-            </w:r>
-            <w:r>
-              <w:rPr>
-                <w:rFonts w:ascii="BRH Malayalam Extra" w:hAnsi="BRH Malayalam Extra" w:cs="BRH Malayalam Extra"/>
-                <w:sz w:val="32"/>
-                <w:szCs w:val="40"/>
-                <w:lang w:val="it-IT"/>
-              </w:rPr>
-              <w:t>K</w:t>
-            </w:r>
-            <w:r>
-              <w:rPr>
-                <w:rFonts w:ascii="BRH Malayalam Extra" w:hAnsi="BRH Malayalam Extra" w:cs="BRH Malayalam Extra"/>
-                <w:sz w:val="26"/>
-                <w:szCs w:val="40"/>
-                <w:lang w:val="it-IT"/>
-              </w:rPr>
-              <w:t>–</w:t>
-            </w:r>
-            <w:r>
-              <w:rPr>
-                <w:rFonts w:ascii="BRH Malayalam Extra" w:hAnsi="BRH Malayalam Extra" w:cs="BRH Malayalam Extra"/>
-                <w:sz w:val="32"/>
-                <w:szCs w:val="40"/>
-                <w:lang w:val="it-IT"/>
-              </w:rPr>
-              <w:t xml:space="preserve"> | bz</w:t>
-            </w:r>
-            <w:r>
-              <w:rPr>
-                <w:rFonts w:ascii="BRH Malayalam Extra" w:hAnsi="BRH Malayalam Extra" w:cs="BRH Malayalam Extra"/>
-                <w:sz w:val="26"/>
-                <w:szCs w:val="40"/>
-                <w:lang w:val="it-IT"/>
-              </w:rPr>
-              <w:t>–</w:t>
-            </w:r>
-            <w:r>
-              <w:rPr>
-                <w:rFonts w:ascii="BRH Malayalam Extra" w:hAnsi="BRH Malayalam Extra" w:cs="BRH Malayalam Extra"/>
-                <w:sz w:val="32"/>
-                <w:szCs w:val="40"/>
-                <w:lang w:val="it-IT"/>
-              </w:rPr>
-              <w:t>by</w:t>
-            </w:r>
-            <w:r>
-              <w:rPr>
-                <w:rFonts w:ascii="BRH Malayalam Extra" w:hAnsi="BRH Malayalam Extra" w:cs="BRH Malayalam Extra"/>
-                <w:sz w:val="26"/>
-                <w:szCs w:val="40"/>
-                <w:lang w:val="it-IT"/>
-              </w:rPr>
-              <w:t>–</w:t>
-            </w:r>
-            <w:r>
-              <w:rPr>
-                <w:rFonts w:ascii="BRH Malayalam Extra" w:hAnsi="BRH Malayalam Extra" w:cs="BRH Malayalam Extra"/>
-                <w:sz w:val="32"/>
-                <w:szCs w:val="40"/>
-                <w:highlight w:val="green"/>
-                <w:lang w:val="it-IT"/>
-              </w:rPr>
-              <w:t>p</w:t>
-            </w:r>
-            <w:r>
-              <w:rPr>
-                <w:rFonts w:ascii="BRH Malayalam Extra" w:hAnsi="BRH Malayalam Extra" w:cs="BRH Malayalam Extra"/>
-                <w:sz w:val="26"/>
-                <w:szCs w:val="40"/>
-                <w:highlight w:val="green"/>
-                <w:lang w:val="it-IT"/>
-              </w:rPr>
-              <w:t>–</w:t>
-            </w:r>
-            <w:r>
-              <w:rPr>
-                <w:rFonts w:ascii="BRH Malayalam Extra" w:hAnsi="BRH Malayalam Extra" w:cs="BRH Malayalam Extra"/>
-                <w:sz w:val="32"/>
-                <w:szCs w:val="40"/>
-                <w:lang w:val="it-IT"/>
-              </w:rPr>
-              <w:t>J | A¥²˜ |</w:t>
-            </w:r>
-          </w:p>
-          <w:p>
-            <w:pPr>
-              <w:widowControl w:val="0"/>
-              <w:autoSpaceDE w:val="0"/>
-              <w:autoSpaceDN w:val="0"/>
-              <w:adjustRightInd w:val="0"/>
-              <w:spacing w:before="0" w:line="240" w:lineRule="auto"/>
-              <w:rPr>
-                <w:rFonts w:ascii="BRH Malayalam Extra" w:hAnsi="BRH Malayalam Extra" w:cs="BRH Malayalam Extra"/>
-                <w:sz w:val="32"/>
-                <w:szCs w:val="40"/>
-                <w:lang w:val="it-IT"/>
-              </w:rPr>
-            </w:pPr>
-            <w:r>
-              <w:rPr>
-                <w:rFonts w:ascii="BRH Malayalam Extra" w:hAnsi="BRH Malayalam Extra" w:cs="BRH Malayalam Extra"/>
-                <w:sz w:val="32"/>
-                <w:szCs w:val="40"/>
-                <w:lang w:val="it-IT"/>
-              </w:rPr>
-              <w:t>ex</w:t>
-            </w:r>
-            <w:r>
-              <w:rPr>
-                <w:rFonts w:ascii="BRH Malayalam Extra" w:hAnsi="BRH Malayalam Extra" w:cs="BRH Malayalam Extra"/>
-                <w:sz w:val="26"/>
-                <w:szCs w:val="40"/>
-                <w:lang w:val="it-IT"/>
-              </w:rPr>
-              <w:t>–</w:t>
-            </w:r>
-            <w:r>
-              <w:rPr>
-                <w:rFonts w:ascii="BRH Malayalam Extra" w:hAnsi="BRH Malayalam Extra" w:cs="BRH Malayalam Extra"/>
-                <w:sz w:val="32"/>
-                <w:szCs w:val="40"/>
-                <w:lang w:val="it-IT"/>
-              </w:rPr>
-              <w:t>p</w:t>
-            </w:r>
-            <w:r>
-              <w:rPr>
-                <w:rFonts w:ascii="BRH Malayalam Extra" w:hAnsi="BRH Malayalam Extra" w:cs="BRH Malayalam Extra"/>
-                <w:sz w:val="26"/>
-                <w:szCs w:val="40"/>
-                <w:lang w:val="it-IT"/>
-              </w:rPr>
-              <w:t>–</w:t>
-            </w:r>
-            <w:r>
-              <w:rPr>
-                <w:rFonts w:ascii="BRH Malayalam Extra" w:hAnsi="BRH Malayalam Extra" w:cs="BRH Malayalam Extra"/>
-                <w:sz w:val="32"/>
-                <w:szCs w:val="40"/>
-                <w:lang w:val="it-IT"/>
-              </w:rPr>
-              <w:t>K</w:t>
-            </w:r>
-            <w:r>
-              <w:rPr>
-                <w:rFonts w:ascii="BRH Malayalam Extra" w:hAnsi="BRH Malayalam Extra" w:cs="BRH Malayalam Extra"/>
-                <w:sz w:val="26"/>
-                <w:szCs w:val="40"/>
-                <w:lang w:val="it-IT"/>
-              </w:rPr>
-              <w:t>–</w:t>
-            </w:r>
-            <w:r>
-              <w:rPr>
-                <w:rFonts w:ascii="BRH Malayalam Extra" w:hAnsi="BRH Malayalam Extra" w:cs="BRH Malayalam Extra"/>
-                <w:sz w:val="32"/>
-                <w:szCs w:val="40"/>
-                <w:lang w:val="it-IT"/>
-              </w:rPr>
-              <w:t xml:space="preserve"> bz</w:t>
-            </w:r>
-            <w:r>
-              <w:rPr>
-                <w:rFonts w:ascii="BRH Malayalam Extra" w:hAnsi="BRH Malayalam Extra" w:cs="BRH Malayalam Extra"/>
-                <w:sz w:val="26"/>
-                <w:szCs w:val="40"/>
-                <w:lang w:val="it-IT"/>
-              </w:rPr>
-              <w:t>–</w:t>
-            </w:r>
-            <w:r>
-              <w:rPr>
-                <w:rFonts w:ascii="BRH Malayalam Extra" w:hAnsi="BRH Malayalam Extra" w:cs="BRH Malayalam Extra"/>
-                <w:sz w:val="32"/>
-                <w:szCs w:val="40"/>
-                <w:lang w:val="it-IT"/>
-              </w:rPr>
-              <w:t>by</w:t>
-            </w:r>
-            <w:r>
-              <w:rPr>
-                <w:rFonts w:ascii="BRH Malayalam Extra" w:hAnsi="BRH Malayalam Extra" w:cs="BRH Malayalam Extra"/>
-                <w:sz w:val="26"/>
-                <w:szCs w:val="40"/>
-                <w:lang w:val="it-IT"/>
-              </w:rPr>
-              <w:t>–</w:t>
-            </w:r>
-            <w:r>
-              <w:rPr>
-                <w:rFonts w:ascii="BRH Malayalam Extra" w:hAnsi="BRH Malayalam Extra" w:cs="BRH Malayalam Extra"/>
-                <w:sz w:val="32"/>
-                <w:szCs w:val="40"/>
-                <w:lang w:val="it-IT"/>
-              </w:rPr>
-              <w:t>¥</w:t>
-            </w:r>
-            <w:r>
-              <w:rPr>
-                <w:rFonts w:ascii="BRH Malayalam Extra" w:hAnsi="BRH Malayalam Extra" w:cs="BRH Malayalam Extra"/>
-                <w:sz w:val="32"/>
-                <w:szCs w:val="40"/>
-                <w:highlight w:val="green"/>
-                <w:lang w:val="it-IT"/>
-              </w:rPr>
-              <w:t>p</w:t>
-            </w:r>
-            <w:r>
-              <w:rPr>
-                <w:rFonts w:ascii="BRH Malayalam Extra" w:hAnsi="BRH Malayalam Extra" w:cs="BRH Malayalam Extra"/>
-                <w:sz w:val="26"/>
-                <w:szCs w:val="40"/>
-                <w:highlight w:val="green"/>
-                <w:lang w:val="it-IT"/>
-              </w:rPr>
-              <w:t>–</w:t>
-            </w:r>
-            <w:r>
-              <w:rPr>
-                <w:rFonts w:ascii="BRH Malayalam Extra" w:hAnsi="BRH Malayalam Extra" w:cs="BRH Malayalam Extra"/>
-                <w:sz w:val="32"/>
-                <w:szCs w:val="40"/>
-                <w:lang w:val="it-IT"/>
-              </w:rPr>
-              <w:t xml:space="preserve">x </w:t>
-            </w:r>
-            <w:r>
-              <w:rPr>
-                <w:rFonts w:ascii="BRH Malayalam Extra" w:hAnsi="BRH Malayalam Extra" w:cs="BRH Malayalam Extra"/>
-                <w:sz w:val="32"/>
-                <w:szCs w:val="40"/>
-                <w:highlight w:val="green"/>
-                <w:lang w:val="it-IT"/>
-              </w:rPr>
-              <w:t>bz</w:t>
-            </w:r>
-            <w:r>
-              <w:rPr>
-                <w:rFonts w:ascii="BRH Malayalam Extra" w:hAnsi="BRH Malayalam Extra" w:cs="BRH Malayalam Extra"/>
-                <w:sz w:val="26"/>
-                <w:szCs w:val="40"/>
-                <w:lang w:val="it-IT"/>
-              </w:rPr>
-              <w:t>–</w:t>
-            </w:r>
-            <w:r>
-              <w:rPr>
-                <w:rFonts w:ascii="BRH Malayalam Extra" w:hAnsi="BRH Malayalam Extra" w:cs="BRH Malayalam Extra"/>
-                <w:sz w:val="32"/>
-                <w:szCs w:val="40"/>
-                <w:lang w:val="it-IT"/>
-              </w:rPr>
-              <w:t>by</w:t>
-            </w:r>
-            <w:r>
-              <w:rPr>
-                <w:rFonts w:ascii="BRH Malayalam Extra" w:hAnsi="BRH Malayalam Extra" w:cs="BRH Malayalam Extra"/>
-                <w:sz w:val="26"/>
-                <w:szCs w:val="40"/>
-                <w:lang w:val="it-IT"/>
-              </w:rPr>
-              <w:t>–</w:t>
-            </w:r>
-            <w:r>
-              <w:rPr>
-                <w:rFonts w:ascii="BRH Malayalam Extra" w:hAnsi="BRH Malayalam Extra" w:cs="BRH Malayalam Extra"/>
-                <w:sz w:val="32"/>
-                <w:szCs w:val="40"/>
-                <w:highlight w:val="green"/>
-                <w:lang w:val="it-IT"/>
-              </w:rPr>
-              <w:t>p</w:t>
-            </w:r>
-            <w:r>
-              <w:rPr>
-                <w:rFonts w:ascii="BRH Malayalam Extra" w:hAnsi="BRH Malayalam Extra" w:cs="BRH Malayalam Extra"/>
-                <w:sz w:val="26"/>
-                <w:szCs w:val="40"/>
-                <w:lang w:val="it-IT"/>
-              </w:rPr>
-              <w:t>–</w:t>
-            </w:r>
-            <w:r>
-              <w:rPr>
-                <w:rFonts w:ascii="BRH Malayalam Extra" w:hAnsi="BRH Malayalam Extra" w:cs="BRH Malayalam Extra"/>
-                <w:sz w:val="32"/>
-                <w:szCs w:val="40"/>
-                <w:lang w:val="it-IT"/>
-              </w:rPr>
-              <w:t xml:space="preserve">J </w:t>
-            </w:r>
-            <w:r>
-              <w:rPr>
-                <w:rFonts w:ascii="BRH Malayalam Extra" w:hAnsi="BRH Malayalam Extra" w:cs="BRH Malayalam Extra"/>
-                <w:sz w:val="32"/>
-                <w:szCs w:val="40"/>
-                <w:highlight w:val="green"/>
-                <w:lang w:val="it-IT"/>
-              </w:rPr>
-              <w:t>ex</w:t>
-            </w:r>
-            <w:r>
-              <w:rPr>
-                <w:rFonts w:ascii="BRH Malayalam Extra" w:hAnsi="BRH Malayalam Extra" w:cs="BRH Malayalam Extra"/>
-                <w:sz w:val="26"/>
-                <w:szCs w:val="40"/>
-                <w:lang w:val="it-IT"/>
-              </w:rPr>
-              <w:t>–</w:t>
-            </w:r>
-            <w:r>
-              <w:rPr>
-                <w:rFonts w:ascii="BRH Malayalam Extra" w:hAnsi="BRH Malayalam Extra" w:cs="BRH Malayalam Extra"/>
-                <w:sz w:val="32"/>
-                <w:szCs w:val="40"/>
-                <w:highlight w:val="green"/>
-                <w:lang w:val="it-IT"/>
-              </w:rPr>
-              <w:t>p</w:t>
-            </w:r>
-            <w:r>
-              <w:rPr>
-                <w:rFonts w:ascii="BRH Malayalam Extra" w:hAnsi="BRH Malayalam Extra" w:cs="BRH Malayalam Extra"/>
-                <w:sz w:val="26"/>
-                <w:szCs w:val="40"/>
-                <w:lang w:val="it-IT"/>
-              </w:rPr>
-              <w:t>–</w:t>
-            </w:r>
-            <w:r>
-              <w:rPr>
-                <w:rFonts w:ascii="BRH Malayalam Extra" w:hAnsi="BRH Malayalam Extra" w:cs="BRH Malayalam Extra"/>
-                <w:sz w:val="32"/>
-                <w:szCs w:val="40"/>
-                <w:highlight w:val="green"/>
-                <w:lang w:val="it-IT"/>
-              </w:rPr>
-              <w:t>K</w:t>
-            </w:r>
-            <w:r>
-              <w:rPr>
-                <w:rFonts w:ascii="BRH Malayalam Extra" w:hAnsi="BRH Malayalam Extra" w:cs="BRH Malayalam Extra"/>
-                <w:sz w:val="26"/>
-                <w:szCs w:val="40"/>
-                <w:lang w:val="it-IT"/>
-              </w:rPr>
-              <w:t>–</w:t>
-            </w:r>
-            <w:r>
-              <w:rPr>
-                <w:rFonts w:ascii="BRH Malayalam Extra" w:hAnsi="BRH Malayalam Extra" w:cs="BRH Malayalam Extra"/>
-                <w:sz w:val="32"/>
-                <w:szCs w:val="40"/>
-                <w:lang w:val="it-IT"/>
-              </w:rPr>
-              <w:t xml:space="preserve"> </w:t>
-            </w:r>
-            <w:r>
-              <w:rPr>
-                <w:rFonts w:ascii="BRH Malayalam Extra" w:hAnsi="BRH Malayalam Extra" w:cs="BRH Malayalam Extra"/>
-                <w:sz w:val="32"/>
-                <w:szCs w:val="40"/>
-                <w:highlight w:val="green"/>
-                <w:lang w:val="it-IT"/>
-              </w:rPr>
-              <w:t>ex</w:t>
-            </w:r>
-            <w:r>
-              <w:rPr>
-                <w:rFonts w:ascii="BRH Malayalam Extra" w:hAnsi="BRH Malayalam Extra" w:cs="BRH Malayalam Extra"/>
-                <w:sz w:val="26"/>
-                <w:szCs w:val="40"/>
-                <w:highlight w:val="green"/>
-                <w:lang w:val="it-IT"/>
-              </w:rPr>
-              <w:t>–</w:t>
-            </w:r>
-            <w:r>
-              <w:rPr>
-                <w:rFonts w:ascii="BRH Malayalam Extra" w:hAnsi="BRH Malayalam Extra" w:cs="BRH Malayalam Extra"/>
-                <w:sz w:val="32"/>
-                <w:szCs w:val="40"/>
-                <w:highlight w:val="green"/>
-                <w:lang w:val="it-IT"/>
-              </w:rPr>
-              <w:t>p</w:t>
-            </w:r>
-            <w:r>
-              <w:rPr>
-                <w:rFonts w:ascii="BRH Malayalam Extra" w:hAnsi="BRH Malayalam Extra" w:cs="BRH Malayalam Extra"/>
-                <w:sz w:val="26"/>
-                <w:szCs w:val="40"/>
-                <w:highlight w:val="green"/>
-                <w:lang w:val="it-IT"/>
-              </w:rPr>
-              <w:t>–</w:t>
-            </w:r>
-            <w:r>
-              <w:rPr>
-                <w:rFonts w:ascii="BRH Malayalam Extra" w:hAnsi="BRH Malayalam Extra" w:cs="BRH Malayalam Extra"/>
-                <w:sz w:val="32"/>
-                <w:szCs w:val="40"/>
-                <w:lang w:val="it-IT"/>
-              </w:rPr>
-              <w:t>K</w:t>
-            </w:r>
-            <w:r>
-              <w:rPr>
-                <w:rFonts w:ascii="BRH Malayalam Extra" w:hAnsi="BRH Malayalam Extra" w:cs="BRH Malayalam Extra"/>
-                <w:sz w:val="26"/>
-                <w:szCs w:val="40"/>
-                <w:lang w:val="it-IT"/>
-              </w:rPr>
-              <w:t>–</w:t>
-            </w:r>
-            <w:r>
-              <w:rPr>
-                <w:rFonts w:ascii="BRH Malayalam Extra" w:hAnsi="BRH Malayalam Extra" w:cs="BRH Malayalam Extra"/>
-                <w:sz w:val="32"/>
-                <w:szCs w:val="40"/>
-                <w:lang w:val="it-IT"/>
-              </w:rPr>
-              <w:t xml:space="preserve"> </w:t>
-            </w:r>
-            <w:r>
-              <w:rPr>
-                <w:rFonts w:ascii="BRH Malayalam Extra" w:hAnsi="BRH Malayalam Extra" w:cs="BRH Malayalam Extra"/>
-                <w:sz w:val="32"/>
-                <w:szCs w:val="40"/>
-                <w:highlight w:val="green"/>
-                <w:lang w:val="it-IT"/>
-              </w:rPr>
-              <w:t>bz</w:t>
-            </w:r>
-            <w:r>
-              <w:rPr>
-                <w:rFonts w:ascii="BRH Malayalam Extra" w:hAnsi="BRH Malayalam Extra" w:cs="BRH Malayalam Extra"/>
-                <w:sz w:val="26"/>
-                <w:szCs w:val="40"/>
-                <w:lang w:val="it-IT"/>
-              </w:rPr>
-              <w:t>–</w:t>
-            </w:r>
-            <w:r>
-              <w:rPr>
-                <w:rFonts w:ascii="BRH Malayalam Extra" w:hAnsi="BRH Malayalam Extra" w:cs="BRH Malayalam Extra"/>
-                <w:sz w:val="32"/>
-                <w:szCs w:val="40"/>
-                <w:lang w:val="it-IT"/>
-              </w:rPr>
-              <w:t>by</w:t>
-            </w:r>
-            <w:r>
-              <w:rPr>
-                <w:rFonts w:ascii="BRH Malayalam Extra" w:hAnsi="BRH Malayalam Extra" w:cs="BRH Malayalam Extra"/>
-                <w:sz w:val="26"/>
-                <w:szCs w:val="40"/>
-                <w:lang w:val="it-IT"/>
-              </w:rPr>
-              <w:t>–</w:t>
-            </w:r>
-            <w:r>
-              <w:rPr>
-                <w:rFonts w:ascii="BRH Malayalam Extra" w:hAnsi="BRH Malayalam Extra" w:cs="BRH Malayalam Extra"/>
-                <w:sz w:val="32"/>
-                <w:szCs w:val="40"/>
-                <w:lang w:val="it-IT"/>
-              </w:rPr>
-              <w:t xml:space="preserve">¥px </w:t>
-            </w:r>
-          </w:p>
-          <w:p>
-            <w:pPr>
-              <w:widowControl w:val="0"/>
-              <w:autoSpaceDE w:val="0"/>
-              <w:autoSpaceDN w:val="0"/>
-              <w:adjustRightInd w:val="0"/>
-              <w:spacing w:before="0" w:line="240" w:lineRule="auto"/>
-              <w:rPr>
-                <w:rFonts w:ascii="BRH Malayalam Extra" w:hAnsi="BRH Malayalam Extra" w:cs="BRH Malayalam Extra"/>
-                <w:sz w:val="32"/>
-                <w:szCs w:val="40"/>
-                <w:lang w:val="it-IT"/>
-              </w:rPr>
-            </w:pPr>
-            <w:r>
-              <w:rPr>
-                <w:rFonts w:ascii="BRH Malayalam Extra" w:hAnsi="BRH Malayalam Extra" w:cs="BRH Malayalam Extra"/>
-                <w:sz w:val="32"/>
-                <w:szCs w:val="40"/>
-                <w:lang w:val="it-IT"/>
-              </w:rPr>
+                <w:rFonts w:ascii="BRH Malayalam Extra" w:hAnsi="BRH Malayalam Extra" w:cs="BRH Malayalam Extra"/>
+                <w:sz w:val="32"/>
+                <w:szCs w:val="40"/>
+                <w:lang w:val="it-IT"/>
+              </w:rPr>
+              <w:lastRenderedPageBreak/>
               <w:t>„¥² „¥²</w:t>
             </w:r>
             <w:r>
@@ -27413,7 +27344,6 @@
                 <w:szCs w:val="40"/>
                 <w:lang w:val="it-IT"/>
               </w:rPr>
-              <w:lastRenderedPageBreak/>
               <w:t>px E</w:t>
             </w:r>
             <w:r>
@@ -27664,6 +27594,162 @@
                 <w:lang w:val="it-IT"/>
               </w:rPr>
             </w:pPr>
+            <w:r>
+              <w:rPr>
+                <w:rFonts w:cs="BRH Malayalam Extra"/>
+                <w:szCs w:val="40"/>
+                <w:lang w:val="it-IT"/>
+              </w:rPr>
+              <w:t>1</w:t>
+            </w:r>
+            <w:r>
+              <w:rPr>
+                <w:rFonts w:ascii="BRH Malayalam Extra" w:hAnsi="BRH Malayalam Extra" w:cs="BRH Malayalam Extra"/>
+                <w:sz w:val="32"/>
+                <w:szCs w:val="40"/>
+                <w:lang w:val="it-IT"/>
+              </w:rPr>
+              <w:t>)</w:t>
+            </w:r>
+            <w:r>
+              <w:rPr>
+                <w:rFonts w:cs="BRH Malayalam Extra"/>
+                <w:szCs w:val="40"/>
+                <w:lang w:val="it-IT"/>
+              </w:rPr>
+              <w:t xml:space="preserve">  1</w:t>
+            </w:r>
+            <w:r>
+              <w:rPr>
+                <w:rFonts w:ascii="BRH Malayalam Extra" w:hAnsi="BRH Malayalam Extra" w:cs="BRH Malayalam Extra"/>
+                <w:sz w:val="32"/>
+                <w:szCs w:val="40"/>
+                <w:lang w:val="it-IT"/>
+              </w:rPr>
+              <w:t>.</w:t>
+            </w:r>
+            <w:r>
+              <w:rPr>
+                <w:rFonts w:cs="BRH Malayalam Extra"/>
+                <w:szCs w:val="40"/>
+                <w:lang w:val="it-IT"/>
+              </w:rPr>
+              <w:t>5</w:t>
+            </w:r>
+            <w:r>
+              <w:rPr>
+                <w:rFonts w:ascii="BRH Malayalam Extra" w:hAnsi="BRH Malayalam Extra" w:cs="BRH Malayalam Extra"/>
+                <w:sz w:val="32"/>
+                <w:szCs w:val="40"/>
+                <w:lang w:val="it-IT"/>
+              </w:rPr>
+              <w:t>.</w:t>
+            </w:r>
+            <w:r>
+              <w:rPr>
+                <w:rFonts w:cs="BRH Malayalam Extra"/>
+                <w:szCs w:val="40"/>
+                <w:lang w:val="it-IT"/>
+              </w:rPr>
+              <w:t>7</w:t>
+            </w:r>
+            <w:r>
+              <w:rPr>
+                <w:rFonts w:ascii="BRH Malayalam Extra" w:hAnsi="BRH Malayalam Extra" w:cs="BRH Malayalam Extra"/>
+                <w:sz w:val="32"/>
+                <w:szCs w:val="40"/>
+                <w:lang w:val="it-IT"/>
+              </w:rPr>
+              <w:t>.</w:t>
+            </w:r>
+            <w:r>
+              <w:rPr>
+                <w:rFonts w:cs="BRH Malayalam Extra"/>
+                <w:szCs w:val="40"/>
+                <w:lang w:val="it-IT"/>
+              </w:rPr>
+              <w:t>3</w:t>
+            </w:r>
+            <w:r>
+              <w:rPr>
+                <w:rFonts w:ascii="BRH Malayalam Extra" w:hAnsi="BRH Malayalam Extra" w:cs="BRH Malayalam Extra"/>
+                <w:sz w:val="32"/>
+                <w:szCs w:val="40"/>
+                <w:lang w:val="it-IT"/>
+              </w:rPr>
+              <w:t>(</w:t>
+            </w:r>
+            <w:r>
+              <w:rPr>
+                <w:rFonts w:cs="BRH Malayalam Extra"/>
+                <w:szCs w:val="40"/>
+                <w:lang w:val="it-IT"/>
+              </w:rPr>
+              <w:t>1</w:t>
+            </w:r>
+            <w:r>
+              <w:rPr>
+                <w:rFonts w:ascii="BRH Malayalam Extra" w:hAnsi="BRH Malayalam Extra" w:cs="BRH Malayalam Extra"/>
+                <w:sz w:val="32"/>
+                <w:szCs w:val="40"/>
+                <w:lang w:val="it-IT"/>
+              </w:rPr>
+              <w:t>)-  E</w:t>
+            </w:r>
+            <w:r>
+              <w:rPr>
+                <w:rFonts w:ascii="BRH Malayalam Extra" w:hAnsi="BRH Malayalam Extra" w:cs="BRH Malayalam Extra"/>
+                <w:sz w:val="26"/>
+                <w:szCs w:val="40"/>
+                <w:lang w:val="it-IT"/>
+              </w:rPr>
+              <w:t>–</w:t>
+            </w:r>
+            <w:r>
+              <w:rPr>
+                <w:rFonts w:ascii="BRH Malayalam Extra" w:hAnsi="BRH Malayalam Extra" w:cs="BRH Malayalam Extra"/>
+                <w:sz w:val="32"/>
+                <w:szCs w:val="40"/>
+                <w:lang w:val="it-IT"/>
+              </w:rPr>
+              <w:t>Zp—J | E</w:t>
+            </w:r>
+            <w:r>
+              <w:rPr>
+                <w:rFonts w:ascii="BRH Malayalam Extra" w:hAnsi="BRH Malayalam Extra" w:cs="BRH Malayalam Extra"/>
+                <w:sz w:val="26"/>
+                <w:szCs w:val="40"/>
+                <w:lang w:val="it-IT"/>
+              </w:rPr>
+              <w:t>–</w:t>
+            </w:r>
+            <w:r>
+              <w:rPr>
+                <w:rFonts w:ascii="BRH Malayalam Extra" w:hAnsi="BRH Malayalam Extra" w:cs="BRH Malayalam Extra"/>
+                <w:sz w:val="32"/>
+                <w:szCs w:val="40"/>
+                <w:lang w:val="it-IT"/>
+              </w:rPr>
+              <w:t>Z¡r¡— | G</w:t>
+            </w:r>
+            <w:r>
+              <w:rPr>
+                <w:rFonts w:ascii="BRH Malayalam Extra" w:hAnsi="BRH Malayalam Extra" w:cs="BRH Malayalam Extra"/>
+                <w:sz w:val="26"/>
+                <w:szCs w:val="40"/>
+                <w:lang w:val="it-IT"/>
+              </w:rPr>
+              <w:t>–</w:t>
+            </w:r>
+            <w:r>
+              <w:rPr>
+                <w:rFonts w:ascii="BRH Malayalam Extra" w:hAnsi="BRH Malayalam Extra" w:cs="BRH Malayalam Extra"/>
+                <w:sz w:val="32"/>
+                <w:szCs w:val="40"/>
+                <w:lang w:val="it-IT"/>
+              </w:rPr>
+              <w:t xml:space="preserve">p | </w:t>
+            </w:r>
           </w:p>
           <w:p>
             <w:pPr>
@@ -27679,6 +27765,243 @@
                 <w:lang w:val="it-IT"/>
               </w:rPr>
             </w:pPr>
+            <w:r>
+              <w:rPr>
+                <w:rFonts w:ascii="BRH Malayalam Extra" w:hAnsi="BRH Malayalam Extra" w:cs="BRH Malayalam Extra"/>
+                <w:sz w:val="32"/>
+                <w:szCs w:val="40"/>
+                <w:lang w:val="it-IT"/>
+              </w:rPr>
+              <w:t>E</w:t>
+            </w:r>
+            <w:r>
+              <w:rPr>
+                <w:rFonts w:ascii="BRH Malayalam Extra" w:hAnsi="BRH Malayalam Extra" w:cs="BRH Malayalam Extra"/>
+                <w:sz w:val="26"/>
+                <w:szCs w:val="40"/>
+                <w:lang w:val="it-IT"/>
+              </w:rPr>
+              <w:t>–</w:t>
+            </w:r>
+            <w:r>
+              <w:rPr>
+                <w:rFonts w:ascii="BRH Malayalam Extra" w:hAnsi="BRH Malayalam Extra" w:cs="BRH Malayalam Extra"/>
+                <w:sz w:val="32"/>
+                <w:szCs w:val="40"/>
+                <w:lang w:val="it-IT"/>
+              </w:rPr>
+              <w:t>Zp— E</w:t>
+            </w:r>
+            <w:r>
+              <w:rPr>
+                <w:rFonts w:ascii="BRH Malayalam Extra" w:hAnsi="BRH Malayalam Extra" w:cs="BRH Malayalam Extra"/>
+                <w:sz w:val="26"/>
+                <w:szCs w:val="40"/>
+                <w:lang w:val="it-IT"/>
+              </w:rPr>
+              <w:t>–</w:t>
+            </w:r>
+            <w:r>
+              <w:rPr>
+                <w:rFonts w:ascii="BRH Malayalam Extra" w:hAnsi="BRH Malayalam Extra" w:cs="BRH Malayalam Extra"/>
+                <w:sz w:val="32"/>
+                <w:szCs w:val="40"/>
+                <w:lang w:val="it-IT"/>
+              </w:rPr>
+              <w:t>Z¡</w:t>
+            </w:r>
+            <w:r>
+              <w:rPr>
+                <w:rFonts w:ascii="BRH Malayalam Extra" w:hAnsi="BRH Malayalam Extra" w:cs="BRH Malayalam Extra"/>
+                <w:sz w:val="32"/>
+                <w:szCs w:val="40"/>
+                <w:highlight w:val="yellow"/>
+                <w:lang w:val="it-IT"/>
+              </w:rPr>
+              <w:t>r¡— E</w:t>
+            </w:r>
+            <w:r>
+              <w:rPr>
+                <w:rFonts w:ascii="BRH Malayalam Extra" w:hAnsi="BRH Malayalam Extra" w:cs="BRH Malayalam Extra"/>
+                <w:sz w:val="26"/>
+                <w:szCs w:val="40"/>
+                <w:lang w:val="it-IT"/>
+              </w:rPr>
+              <w:t>–</w:t>
+            </w:r>
+            <w:r>
+              <w:rPr>
+                <w:rFonts w:ascii="BRH Malayalam Extra" w:hAnsi="BRH Malayalam Extra" w:cs="BRH Malayalam Extra"/>
+                <w:sz w:val="32"/>
+                <w:szCs w:val="40"/>
+                <w:lang w:val="it-IT"/>
+              </w:rPr>
+              <w:t>Z¡</w:t>
+            </w:r>
+            <w:r>
+              <w:rPr>
+                <w:rFonts w:ascii="BRH Malayalam Extra" w:hAnsi="BRH Malayalam Extra" w:cs="BRH Malayalam Extra"/>
+                <w:sz w:val="32"/>
+                <w:szCs w:val="40"/>
+                <w:highlight w:val="yellow"/>
+                <w:lang w:val="it-IT"/>
+              </w:rPr>
+              <w:t>r¡— E</w:t>
+            </w:r>
+            <w:r>
+              <w:rPr>
+                <w:rFonts w:ascii="BRH Malayalam Extra" w:hAnsi="BRH Malayalam Extra" w:cs="BRH Malayalam Extra"/>
+                <w:sz w:val="26"/>
+                <w:szCs w:val="40"/>
+                <w:lang w:val="it-IT"/>
+              </w:rPr>
+              <w:t>–</w:t>
+            </w:r>
+            <w:r>
+              <w:rPr>
+                <w:rFonts w:ascii="BRH Malayalam Extra" w:hAnsi="BRH Malayalam Extra" w:cs="BRH Malayalam Extra"/>
+                <w:sz w:val="32"/>
+                <w:szCs w:val="40"/>
+                <w:lang w:val="it-IT"/>
+              </w:rPr>
+              <w:t>Zp— E</w:t>
+            </w:r>
+            <w:r>
+              <w:rPr>
+                <w:rFonts w:ascii="BRH Malayalam Extra" w:hAnsi="BRH Malayalam Extra" w:cs="BRH Malayalam Extra"/>
+                <w:sz w:val="26"/>
+                <w:szCs w:val="40"/>
+                <w:lang w:val="it-IT"/>
+              </w:rPr>
+              <w:t>–</w:t>
+            </w:r>
+            <w:r>
+              <w:rPr>
+                <w:rFonts w:ascii="BRH Malayalam Extra" w:hAnsi="BRH Malayalam Extra" w:cs="BRH Malayalam Extra"/>
+                <w:sz w:val="32"/>
+                <w:szCs w:val="40"/>
+                <w:lang w:val="it-IT"/>
+              </w:rPr>
+              <w:t>Zp— E</w:t>
+            </w:r>
+            <w:r>
+              <w:rPr>
+                <w:rFonts w:ascii="BRH Malayalam Extra" w:hAnsi="BRH Malayalam Extra" w:cs="BRH Malayalam Extra"/>
+                <w:sz w:val="26"/>
+                <w:szCs w:val="40"/>
+                <w:lang w:val="it-IT"/>
+              </w:rPr>
+              <w:t>–</w:t>
+            </w:r>
+            <w:r>
+              <w:rPr>
+                <w:rFonts w:ascii="BRH Malayalam Extra" w:hAnsi="BRH Malayalam Extra" w:cs="BRH Malayalam Extra"/>
+                <w:sz w:val="32"/>
+                <w:szCs w:val="40"/>
+                <w:lang w:val="it-IT"/>
+              </w:rPr>
+              <w:t>Z¡¥rû</w:t>
+            </w:r>
+            <w:r>
+              <w:rPr>
+                <w:rFonts w:ascii="BRH Malayalam Extra" w:hAnsi="BRH Malayalam Extra" w:cs="BRH Malayalam Extra"/>
+                <w:sz w:val="26"/>
+                <w:szCs w:val="40"/>
+                <w:lang w:val="it-IT"/>
+              </w:rPr>
+              <w:t>–</w:t>
+            </w:r>
+            <w:r>
+              <w:rPr>
+                <w:rFonts w:ascii="BRH Malayalam Extra" w:hAnsi="BRH Malayalam Extra" w:cs="BRH Malayalam Extra"/>
+                <w:sz w:val="32"/>
+                <w:szCs w:val="40"/>
+                <w:lang w:val="it-IT"/>
+              </w:rPr>
+              <w:t>¤¤pp ªZ¡</w:t>
+            </w:r>
+            <w:r>
+              <w:rPr>
+                <w:rFonts w:ascii="BRH Malayalam Extra" w:hAnsi="BRH Malayalam Extra" w:cs="BRH Malayalam Extra"/>
+                <w:sz w:val="32"/>
+                <w:szCs w:val="40"/>
+                <w:highlight w:val="yellow"/>
+                <w:lang w:val="it-IT"/>
+              </w:rPr>
+              <w:t>r¡— E</w:t>
+            </w:r>
+            <w:r>
+              <w:rPr>
+                <w:rFonts w:ascii="BRH Malayalam Extra" w:hAnsi="BRH Malayalam Extra" w:cs="BRH Malayalam Extra"/>
+                <w:sz w:val="26"/>
+                <w:szCs w:val="40"/>
+                <w:lang w:val="it-IT"/>
+              </w:rPr>
+              <w:t>–</w:t>
+            </w:r>
+            <w:r>
+              <w:rPr>
+                <w:rFonts w:ascii="BRH Malayalam Extra" w:hAnsi="BRH Malayalam Extra" w:cs="BRH Malayalam Extra"/>
+                <w:sz w:val="32"/>
+                <w:szCs w:val="40"/>
+                <w:lang w:val="it-IT"/>
+              </w:rPr>
+              <w:t>Zp— E</w:t>
+            </w:r>
+            <w:r>
+              <w:rPr>
+                <w:rFonts w:ascii="BRH Malayalam Extra" w:hAnsi="BRH Malayalam Extra" w:cs="BRH Malayalam Extra"/>
+                <w:sz w:val="26"/>
+                <w:szCs w:val="40"/>
+                <w:lang w:val="it-IT"/>
+              </w:rPr>
+              <w:t>–</w:t>
+            </w:r>
+            <w:r>
+              <w:rPr>
+                <w:rFonts w:ascii="BRH Malayalam Extra" w:hAnsi="BRH Malayalam Extra" w:cs="BRH Malayalam Extra"/>
+                <w:sz w:val="32"/>
+                <w:szCs w:val="40"/>
+                <w:lang w:val="it-IT"/>
+              </w:rPr>
+              <w:t>Zp— E</w:t>
+            </w:r>
+            <w:r>
+              <w:rPr>
+                <w:rFonts w:ascii="BRH Malayalam Extra" w:hAnsi="BRH Malayalam Extra" w:cs="BRH Malayalam Extra"/>
+                <w:sz w:val="26"/>
+                <w:szCs w:val="40"/>
+                <w:lang w:val="it-IT"/>
+              </w:rPr>
+              <w:t>–</w:t>
+            </w:r>
+            <w:r>
+              <w:rPr>
+                <w:rFonts w:ascii="BRH Malayalam Extra" w:hAnsi="BRH Malayalam Extra" w:cs="BRH Malayalam Extra"/>
+                <w:sz w:val="32"/>
+                <w:szCs w:val="40"/>
+                <w:lang w:val="it-IT"/>
+              </w:rPr>
+              <w:t>Z¡¥rû</w:t>
+            </w:r>
+            <w:r>
+              <w:rPr>
+                <w:rFonts w:ascii="BRH Malayalam Extra" w:hAnsi="BRH Malayalam Extra" w:cs="BRH Malayalam Extra"/>
+                <w:sz w:val="26"/>
+                <w:szCs w:val="40"/>
+                <w:lang w:val="it-IT"/>
+              </w:rPr>
+              <w:t>–</w:t>
+            </w:r>
+            <w:r>
+              <w:rPr>
+                <w:rFonts w:ascii="BRH Malayalam Extra" w:hAnsi="BRH Malayalam Extra" w:cs="BRH Malayalam Extra"/>
+                <w:sz w:val="32"/>
+                <w:szCs w:val="40"/>
+                <w:lang w:val="it-IT"/>
+              </w:rPr>
+              <w:t xml:space="preserve">p | </w:t>
+            </w:r>
           </w:p>
           <w:p>
             <w:pPr>
@@ -27700,429 +28023,7 @@
                 <w:szCs w:val="40"/>
                 <w:lang w:val="it-IT"/>
               </w:rPr>
-              <w:t>1</w:t>
-            </w:r>
-            <w:r>
-              <w:rPr>
-                <w:rFonts w:ascii="BRH Malayalam Extra" w:hAnsi="BRH Malayalam Extra" w:cs="BRH Malayalam Extra"/>
-                <w:sz w:val="32"/>
-                <w:szCs w:val="40"/>
-                <w:lang w:val="it-IT"/>
-              </w:rPr>
-              <w:t>)</w:t>
-            </w:r>
-            <w:r>
-              <w:rPr>
-                <w:rFonts w:cs="BRH Malayalam Extra"/>
-                <w:szCs w:val="40"/>
-                <w:lang w:val="it-IT"/>
-              </w:rPr>
-              <w:t xml:space="preserve">  1</w:t>
-            </w:r>
-            <w:r>
-              <w:rPr>
-                <w:rFonts w:ascii="BRH Malayalam Extra" w:hAnsi="BRH Malayalam Extra" w:cs="BRH Malayalam Extra"/>
-                <w:sz w:val="32"/>
-                <w:szCs w:val="40"/>
-                <w:lang w:val="it-IT"/>
-              </w:rPr>
-              <w:t>.</w:t>
-            </w:r>
-            <w:r>
-              <w:rPr>
-                <w:rFonts w:cs="BRH Malayalam Extra"/>
-                <w:szCs w:val="40"/>
-                <w:lang w:val="it-IT"/>
-              </w:rPr>
-              <w:t>5</w:t>
-            </w:r>
-            <w:r>
-              <w:rPr>
-                <w:rFonts w:ascii="BRH Malayalam Extra" w:hAnsi="BRH Malayalam Extra" w:cs="BRH Malayalam Extra"/>
-                <w:sz w:val="32"/>
-                <w:szCs w:val="40"/>
-                <w:lang w:val="it-IT"/>
-              </w:rPr>
-              <w:t>.</w:t>
-            </w:r>
-            <w:r>
-              <w:rPr>
-                <w:rFonts w:cs="BRH Malayalam Extra"/>
-                <w:szCs w:val="40"/>
-                <w:lang w:val="it-IT"/>
-              </w:rPr>
-              <w:t>7</w:t>
-            </w:r>
-            <w:r>
-              <w:rPr>
-                <w:rFonts w:ascii="BRH Malayalam Extra" w:hAnsi="BRH Malayalam Extra" w:cs="BRH Malayalam Extra"/>
-                <w:sz w:val="32"/>
-                <w:szCs w:val="40"/>
-                <w:lang w:val="it-IT"/>
-              </w:rPr>
-              <w:t>.</w:t>
-            </w:r>
-            <w:r>
-              <w:rPr>
-                <w:rFonts w:cs="BRH Malayalam Extra"/>
-                <w:szCs w:val="40"/>
-                <w:lang w:val="it-IT"/>
-              </w:rPr>
-              <w:t>3</w:t>
-            </w:r>
-            <w:r>
-              <w:rPr>
-                <w:rFonts w:ascii="BRH Malayalam Extra" w:hAnsi="BRH Malayalam Extra" w:cs="BRH Malayalam Extra"/>
-                <w:sz w:val="32"/>
-                <w:szCs w:val="40"/>
-                <w:lang w:val="it-IT"/>
-              </w:rPr>
-              <w:t>(</w:t>
-            </w:r>
-            <w:r>
-              <w:rPr>
-                <w:rFonts w:cs="BRH Malayalam Extra"/>
-                <w:szCs w:val="40"/>
-                <w:lang w:val="it-IT"/>
-              </w:rPr>
-              <w:t>1</w:t>
-            </w:r>
-            <w:r>
-              <w:rPr>
-                <w:rFonts w:ascii="BRH Malayalam Extra" w:hAnsi="BRH Malayalam Extra" w:cs="BRH Malayalam Extra"/>
-                <w:sz w:val="32"/>
-                <w:szCs w:val="40"/>
-                <w:lang w:val="it-IT"/>
-              </w:rPr>
-              <w:t>)-  E</w:t>
-            </w:r>
-            <w:r>
-              <w:rPr>
-                <w:rFonts w:ascii="BRH Malayalam Extra" w:hAnsi="BRH Malayalam Extra" w:cs="BRH Malayalam Extra"/>
-                <w:sz w:val="26"/>
-                <w:szCs w:val="40"/>
-                <w:lang w:val="it-IT"/>
-              </w:rPr>
-              <w:t>–</w:t>
-            </w:r>
-            <w:r>
-              <w:rPr>
-                <w:rFonts w:ascii="BRH Malayalam Extra" w:hAnsi="BRH Malayalam Extra" w:cs="BRH Malayalam Extra"/>
-                <w:sz w:val="32"/>
-                <w:szCs w:val="40"/>
-                <w:lang w:val="it-IT"/>
-              </w:rPr>
-              <w:t>Zp—J | E</w:t>
-            </w:r>
-            <w:r>
-              <w:rPr>
-                <w:rFonts w:ascii="BRH Malayalam Extra" w:hAnsi="BRH Malayalam Extra" w:cs="BRH Malayalam Extra"/>
-                <w:sz w:val="26"/>
-                <w:szCs w:val="40"/>
-                <w:lang w:val="it-IT"/>
-              </w:rPr>
-              <w:t>–</w:t>
-            </w:r>
-            <w:r>
-              <w:rPr>
-                <w:rFonts w:ascii="BRH Malayalam Extra" w:hAnsi="BRH Malayalam Extra" w:cs="BRH Malayalam Extra"/>
-                <w:sz w:val="32"/>
-                <w:szCs w:val="40"/>
-                <w:lang w:val="it-IT"/>
-              </w:rPr>
-              <w:t>Z¡r¡— | G</w:t>
-            </w:r>
-            <w:r>
-              <w:rPr>
-                <w:rFonts w:ascii="BRH Malayalam Extra" w:hAnsi="BRH Malayalam Extra" w:cs="BRH Malayalam Extra"/>
-                <w:sz w:val="26"/>
-                <w:szCs w:val="40"/>
-                <w:lang w:val="it-IT"/>
-              </w:rPr>
-              <w:t>–</w:t>
-            </w:r>
-            <w:r>
-              <w:rPr>
-                <w:rFonts w:ascii="BRH Malayalam Extra" w:hAnsi="BRH Malayalam Extra" w:cs="BRH Malayalam Extra"/>
-                <w:sz w:val="32"/>
-                <w:szCs w:val="40"/>
-                <w:lang w:val="it-IT"/>
-              </w:rPr>
-              <w:t xml:space="preserve">p | </w:t>
-            </w:r>
-          </w:p>
-          <w:p>
-            <w:pPr>
-              <w:widowControl w:val="0"/>
-              <w:autoSpaceDE w:val="0"/>
-              <w:autoSpaceDN w:val="0"/>
-              <w:adjustRightInd w:val="0"/>
-              <w:spacing w:before="0" w:line="240" w:lineRule="auto"/>
-              <w:rPr>
-                <w:rFonts w:ascii="BRH Malayalam Extra" w:hAnsi="BRH Malayalam Extra" w:cs="BRH Malayalam Extra"/>
-                <w:sz w:val="32"/>
-                <w:szCs w:val="40"/>
-                <w:lang w:val="it-IT"/>
-              </w:rPr>
-            </w:pPr>
-            <w:r>
-              <w:rPr>
-                <w:rFonts w:ascii="BRH Malayalam Extra" w:hAnsi="BRH Malayalam Extra" w:cs="BRH Malayalam Extra"/>
-                <w:sz w:val="32"/>
-                <w:szCs w:val="40"/>
-                <w:lang w:val="it-IT"/>
-              </w:rPr>
-              <w:t>E</w:t>
-            </w:r>
-            <w:r>
-              <w:rPr>
-                <w:rFonts w:ascii="BRH Malayalam Extra" w:hAnsi="BRH Malayalam Extra" w:cs="BRH Malayalam Extra"/>
-                <w:sz w:val="26"/>
-                <w:szCs w:val="40"/>
-                <w:lang w:val="it-IT"/>
-              </w:rPr>
-              <w:t>–</w:t>
-            </w:r>
-            <w:r>
-              <w:rPr>
-                <w:rFonts w:ascii="BRH Malayalam Extra" w:hAnsi="BRH Malayalam Extra" w:cs="BRH Malayalam Extra"/>
-                <w:sz w:val="32"/>
-                <w:szCs w:val="40"/>
-                <w:lang w:val="it-IT"/>
-              </w:rPr>
-              <w:t>Zp— E</w:t>
-            </w:r>
-            <w:r>
-              <w:rPr>
-                <w:rFonts w:ascii="BRH Malayalam Extra" w:hAnsi="BRH Malayalam Extra" w:cs="BRH Malayalam Extra"/>
-                <w:sz w:val="26"/>
-                <w:szCs w:val="40"/>
-                <w:lang w:val="it-IT"/>
-              </w:rPr>
-              <w:t>–</w:t>
-            </w:r>
-            <w:r>
-              <w:rPr>
-                <w:rFonts w:ascii="BRH Malayalam Extra" w:hAnsi="BRH Malayalam Extra" w:cs="BRH Malayalam Extra"/>
-                <w:sz w:val="32"/>
-                <w:szCs w:val="40"/>
-                <w:lang w:val="it-IT"/>
-              </w:rPr>
-              <w:t>Z¡</w:t>
-            </w:r>
-            <w:r>
-              <w:rPr>
-                <w:rFonts w:ascii="BRH Malayalam Extra" w:hAnsi="BRH Malayalam Extra" w:cs="BRH Malayalam Extra"/>
-                <w:sz w:val="32"/>
-                <w:szCs w:val="40"/>
-                <w:highlight w:val="yellow"/>
-                <w:lang w:val="it-IT"/>
-              </w:rPr>
-              <w:t>r¡— E</w:t>
-            </w:r>
-            <w:r>
-              <w:rPr>
-                <w:rFonts w:ascii="BRH Malayalam Extra" w:hAnsi="BRH Malayalam Extra" w:cs="BRH Malayalam Extra"/>
-                <w:sz w:val="26"/>
-                <w:szCs w:val="40"/>
-                <w:lang w:val="it-IT"/>
-              </w:rPr>
-              <w:t>–</w:t>
-            </w:r>
-            <w:r>
-              <w:rPr>
-                <w:rFonts w:ascii="BRH Malayalam Extra" w:hAnsi="BRH Malayalam Extra" w:cs="BRH Malayalam Extra"/>
-                <w:sz w:val="32"/>
-                <w:szCs w:val="40"/>
-                <w:lang w:val="it-IT"/>
-              </w:rPr>
-              <w:t>Z¡</w:t>
-            </w:r>
-            <w:r>
-              <w:rPr>
-                <w:rFonts w:ascii="BRH Malayalam Extra" w:hAnsi="BRH Malayalam Extra" w:cs="BRH Malayalam Extra"/>
-                <w:sz w:val="32"/>
-                <w:szCs w:val="40"/>
-                <w:highlight w:val="yellow"/>
-                <w:lang w:val="it-IT"/>
-              </w:rPr>
-              <w:t>r¡— E</w:t>
-            </w:r>
-            <w:r>
-              <w:rPr>
-                <w:rFonts w:ascii="BRH Malayalam Extra" w:hAnsi="BRH Malayalam Extra" w:cs="BRH Malayalam Extra"/>
-                <w:sz w:val="26"/>
-                <w:szCs w:val="40"/>
-                <w:lang w:val="it-IT"/>
-              </w:rPr>
-              <w:t>–</w:t>
-            </w:r>
-            <w:r>
-              <w:rPr>
-                <w:rFonts w:ascii="BRH Malayalam Extra" w:hAnsi="BRH Malayalam Extra" w:cs="BRH Malayalam Extra"/>
-                <w:sz w:val="32"/>
-                <w:szCs w:val="40"/>
-                <w:lang w:val="it-IT"/>
-              </w:rPr>
-              <w:t>Zp— E</w:t>
-            </w:r>
-            <w:r>
-              <w:rPr>
-                <w:rFonts w:ascii="BRH Malayalam Extra" w:hAnsi="BRH Malayalam Extra" w:cs="BRH Malayalam Extra"/>
-                <w:sz w:val="26"/>
-                <w:szCs w:val="40"/>
-                <w:lang w:val="it-IT"/>
-              </w:rPr>
-              <w:t>–</w:t>
-            </w:r>
-            <w:r>
-              <w:rPr>
-                <w:rFonts w:ascii="BRH Malayalam Extra" w:hAnsi="BRH Malayalam Extra" w:cs="BRH Malayalam Extra"/>
-                <w:sz w:val="32"/>
-                <w:szCs w:val="40"/>
-                <w:lang w:val="it-IT"/>
-              </w:rPr>
-              <w:t>Zp— E</w:t>
-            </w:r>
-            <w:r>
-              <w:rPr>
-                <w:rFonts w:ascii="BRH Malayalam Extra" w:hAnsi="BRH Malayalam Extra" w:cs="BRH Malayalam Extra"/>
-                <w:sz w:val="26"/>
-                <w:szCs w:val="40"/>
-                <w:lang w:val="it-IT"/>
-              </w:rPr>
-              <w:t>–</w:t>
-            </w:r>
-            <w:r>
-              <w:rPr>
-                <w:rFonts w:ascii="BRH Malayalam Extra" w:hAnsi="BRH Malayalam Extra" w:cs="BRH Malayalam Extra"/>
-                <w:sz w:val="32"/>
-                <w:szCs w:val="40"/>
-                <w:lang w:val="it-IT"/>
-              </w:rPr>
-              <w:t>Z¡¥rû</w:t>
-            </w:r>
-            <w:r>
-              <w:rPr>
-                <w:rFonts w:ascii="BRH Malayalam Extra" w:hAnsi="BRH Malayalam Extra" w:cs="BRH Malayalam Extra"/>
-                <w:sz w:val="26"/>
-                <w:szCs w:val="40"/>
-                <w:lang w:val="it-IT"/>
-              </w:rPr>
-              <w:t>–</w:t>
-            </w:r>
-            <w:r>
-              <w:rPr>
-                <w:rFonts w:ascii="BRH Malayalam Extra" w:hAnsi="BRH Malayalam Extra" w:cs="BRH Malayalam Extra"/>
-                <w:sz w:val="32"/>
-                <w:szCs w:val="40"/>
-                <w:lang w:val="it-IT"/>
-              </w:rPr>
-              <w:t>¤¤pp ªZ¡</w:t>
-            </w:r>
-            <w:r>
-              <w:rPr>
-                <w:rFonts w:ascii="BRH Malayalam Extra" w:hAnsi="BRH Malayalam Extra" w:cs="BRH Malayalam Extra"/>
-                <w:sz w:val="32"/>
-                <w:szCs w:val="40"/>
-                <w:highlight w:val="yellow"/>
-                <w:lang w:val="it-IT"/>
-              </w:rPr>
-              <w:t>r¡— E</w:t>
-            </w:r>
-            <w:r>
-              <w:rPr>
-                <w:rFonts w:ascii="BRH Malayalam Extra" w:hAnsi="BRH Malayalam Extra" w:cs="BRH Malayalam Extra"/>
-                <w:sz w:val="26"/>
-                <w:szCs w:val="40"/>
-                <w:lang w:val="it-IT"/>
-              </w:rPr>
-              <w:t>–</w:t>
-            </w:r>
-            <w:r>
-              <w:rPr>
-                <w:rFonts w:ascii="BRH Malayalam Extra" w:hAnsi="BRH Malayalam Extra" w:cs="BRH Malayalam Extra"/>
-                <w:sz w:val="32"/>
-                <w:szCs w:val="40"/>
-                <w:lang w:val="it-IT"/>
-              </w:rPr>
-              <w:t>Zp— E</w:t>
-            </w:r>
-            <w:r>
-              <w:rPr>
-                <w:rFonts w:ascii="BRH Malayalam Extra" w:hAnsi="BRH Malayalam Extra" w:cs="BRH Malayalam Extra"/>
-                <w:sz w:val="26"/>
-                <w:szCs w:val="40"/>
-                <w:lang w:val="it-IT"/>
-              </w:rPr>
-              <w:t>–</w:t>
-            </w:r>
-            <w:r>
-              <w:rPr>
-                <w:rFonts w:ascii="BRH Malayalam Extra" w:hAnsi="BRH Malayalam Extra" w:cs="BRH Malayalam Extra"/>
-                <w:sz w:val="32"/>
-                <w:szCs w:val="40"/>
-                <w:lang w:val="it-IT"/>
-              </w:rPr>
-              <w:t>Zp— E</w:t>
-            </w:r>
-            <w:r>
-              <w:rPr>
-                <w:rFonts w:ascii="BRH Malayalam Extra" w:hAnsi="BRH Malayalam Extra" w:cs="BRH Malayalam Extra"/>
-                <w:sz w:val="26"/>
-                <w:szCs w:val="40"/>
-                <w:lang w:val="it-IT"/>
-              </w:rPr>
-              <w:t>–</w:t>
-            </w:r>
-            <w:r>
-              <w:rPr>
-                <w:rFonts w:ascii="BRH Malayalam Extra" w:hAnsi="BRH Malayalam Extra" w:cs="BRH Malayalam Extra"/>
-                <w:sz w:val="32"/>
-                <w:szCs w:val="40"/>
-                <w:lang w:val="it-IT"/>
-              </w:rPr>
-              <w:t>Z¡¥rû</w:t>
-            </w:r>
-            <w:r>
-              <w:rPr>
-                <w:rFonts w:ascii="BRH Malayalam Extra" w:hAnsi="BRH Malayalam Extra" w:cs="BRH Malayalam Extra"/>
-                <w:sz w:val="26"/>
-                <w:szCs w:val="40"/>
-                <w:lang w:val="it-IT"/>
-              </w:rPr>
-              <w:t>–</w:t>
-            </w:r>
-            <w:r>
-              <w:rPr>
-                <w:rFonts w:ascii="BRH Malayalam Extra" w:hAnsi="BRH Malayalam Extra" w:cs="BRH Malayalam Extra"/>
-                <w:sz w:val="32"/>
-                <w:szCs w:val="40"/>
-                <w:lang w:val="it-IT"/>
-              </w:rPr>
-              <w:t xml:space="preserve">p | </w:t>
-            </w:r>
-          </w:p>
-          <w:p>
-            <w:pPr>
-              <w:widowControl w:val="0"/>
-              <w:autoSpaceDE w:val="0"/>
-              <w:autoSpaceDN w:val="0"/>
-              <w:adjustRightInd w:val="0"/>
-              <w:spacing w:before="0" w:line="240" w:lineRule="auto"/>
-              <w:rPr>
-                <w:rFonts w:ascii="BRH Malayalam Extra" w:hAnsi="BRH Malayalam Extra" w:cs="BRH Malayalam Extra"/>
-                <w:sz w:val="32"/>
-                <w:szCs w:val="40"/>
-                <w:lang w:val="it-IT"/>
-              </w:rPr>
-            </w:pPr>
-            <w:r>
-              <w:rPr>
-                <w:rFonts w:cs="BRH Malayalam Extra"/>
-                <w:szCs w:val="40"/>
-                <w:lang w:val="it-IT"/>
-              </w:rPr>
+              <w:lastRenderedPageBreak/>
               <w:t>2</w:t>
             </w:r>
             <w:r>
@@ -28640,7 +28541,6 @@
                 <w:szCs w:val="40"/>
                 <w:lang w:val="it-IT"/>
               </w:rPr>
-              <w:lastRenderedPageBreak/>
               <w:t>px E</w:t>
             </w:r>
             <w:r>
@@ -28922,6 +28822,181 @@
                 <w:lang w:val="it-IT"/>
               </w:rPr>
             </w:pPr>
+            <w:r>
+              <w:rPr>
+                <w:rFonts w:cs="BRH Malayalam Extra"/>
+                <w:szCs w:val="40"/>
+                <w:lang w:val="it-IT"/>
+              </w:rPr>
+              <w:t>1</w:t>
+            </w:r>
+            <w:r>
+              <w:rPr>
+                <w:rFonts w:ascii="BRH Malayalam Extra" w:hAnsi="BRH Malayalam Extra" w:cs="BRH Malayalam Extra"/>
+                <w:sz w:val="32"/>
+                <w:szCs w:val="40"/>
+                <w:lang w:val="it-IT"/>
+              </w:rPr>
+              <w:t>)</w:t>
+            </w:r>
+            <w:r>
+              <w:rPr>
+                <w:rFonts w:cs="BRH Malayalam Extra"/>
+                <w:szCs w:val="40"/>
+                <w:lang w:val="it-IT"/>
+              </w:rPr>
+              <w:t xml:space="preserve">  </w:t>
+            </w:r>
+            <w:bookmarkStart w:id="3" w:name="_Hlk128842256"/>
+            <w:r>
+              <w:rPr>
+                <w:rFonts w:cs="BRH Malayalam Extra"/>
+                <w:szCs w:val="40"/>
+                <w:lang w:val="it-IT"/>
+              </w:rPr>
+              <w:t>1</w:t>
+            </w:r>
+            <w:r>
+              <w:rPr>
+                <w:rFonts w:ascii="BRH Malayalam Extra" w:hAnsi="BRH Malayalam Extra" w:cs="BRH Malayalam Extra"/>
+                <w:sz w:val="32"/>
+                <w:szCs w:val="40"/>
+                <w:lang w:val="it-IT"/>
+              </w:rPr>
+              <w:t>.</w:t>
+            </w:r>
+            <w:r>
+              <w:rPr>
+                <w:rFonts w:cs="BRH Malayalam Extra"/>
+                <w:szCs w:val="40"/>
+                <w:lang w:val="it-IT"/>
+              </w:rPr>
+              <w:t>5</w:t>
+            </w:r>
+            <w:r>
+              <w:rPr>
+                <w:rFonts w:ascii="BRH Malayalam Extra" w:hAnsi="BRH Malayalam Extra" w:cs="BRH Malayalam Extra"/>
+                <w:sz w:val="32"/>
+                <w:szCs w:val="40"/>
+                <w:lang w:val="it-IT"/>
+              </w:rPr>
+              <w:t>.</w:t>
+            </w:r>
+            <w:r>
+              <w:rPr>
+                <w:rFonts w:cs="BRH Malayalam Extra"/>
+                <w:szCs w:val="40"/>
+                <w:lang w:val="it-IT"/>
+              </w:rPr>
+              <w:t>7</w:t>
+            </w:r>
+            <w:r>
+              <w:rPr>
+                <w:rFonts w:ascii="BRH Malayalam Extra" w:hAnsi="BRH Malayalam Extra" w:cs="BRH Malayalam Extra"/>
+                <w:sz w:val="32"/>
+                <w:szCs w:val="40"/>
+                <w:lang w:val="it-IT"/>
+              </w:rPr>
+              <w:t>.</w:t>
+            </w:r>
+            <w:r>
+              <w:rPr>
+                <w:rFonts w:cs="BRH Malayalam Extra"/>
+                <w:szCs w:val="40"/>
+                <w:lang w:val="it-IT"/>
+              </w:rPr>
+              <w:t>3</w:t>
+            </w:r>
+            <w:r>
+              <w:rPr>
+                <w:rFonts w:ascii="BRH Malayalam Extra" w:hAnsi="BRH Malayalam Extra" w:cs="BRH Malayalam Extra"/>
+                <w:sz w:val="32"/>
+                <w:szCs w:val="40"/>
+                <w:lang w:val="it-IT"/>
+              </w:rPr>
+              <w:t>(</w:t>
+            </w:r>
+            <w:r>
+              <w:rPr>
+                <w:rFonts w:cs="BRH Malayalam Extra"/>
+                <w:szCs w:val="40"/>
+                <w:lang w:val="it-IT"/>
+              </w:rPr>
+              <w:t>1</w:t>
+            </w:r>
+            <w:r>
+              <w:rPr>
+                <w:rFonts w:ascii="BRH Malayalam Extra" w:hAnsi="BRH Malayalam Extra" w:cs="BRH Malayalam Extra"/>
+                <w:sz w:val="32"/>
+                <w:szCs w:val="40"/>
+                <w:lang w:val="it-IT"/>
+              </w:rPr>
+              <w:t xml:space="preserve">)-  </w:t>
+            </w:r>
+            <w:bookmarkEnd w:id="3"/>
+            <w:r>
+              <w:rPr>
+                <w:rFonts w:ascii="BRH Malayalam Extra" w:hAnsi="BRH Malayalam Extra" w:cs="BRH Malayalam Extra"/>
+                <w:sz w:val="32"/>
+                <w:szCs w:val="40"/>
+                <w:lang w:val="it-IT"/>
+              </w:rPr>
+              <w:t>E</w:t>
+            </w:r>
+            <w:r>
+              <w:rPr>
+                <w:rFonts w:ascii="BRH Malayalam Extra" w:hAnsi="BRH Malayalam Extra" w:cs="BRH Malayalam Extra"/>
+                <w:sz w:val="26"/>
+                <w:szCs w:val="40"/>
+                <w:lang w:val="it-IT"/>
+              </w:rPr>
+              <w:t>–</w:t>
+            </w:r>
+            <w:r>
+              <w:rPr>
+                <w:rFonts w:ascii="BRH Malayalam Extra" w:hAnsi="BRH Malayalam Extra" w:cs="BRH Malayalam Extra"/>
+                <w:sz w:val="32"/>
+                <w:szCs w:val="40"/>
+                <w:lang w:val="it-IT"/>
+              </w:rPr>
+              <w:t>Zp—J | E</w:t>
+            </w:r>
+            <w:r>
+              <w:rPr>
+                <w:rFonts w:ascii="BRH Malayalam Extra" w:hAnsi="BRH Malayalam Extra" w:cs="BRH Malayalam Extra"/>
+                <w:sz w:val="26"/>
+                <w:szCs w:val="40"/>
+                <w:lang w:val="it-IT"/>
+              </w:rPr>
+              <w:t>–</w:t>
+            </w:r>
+            <w:r>
+              <w:rPr>
+                <w:rFonts w:ascii="BRH Malayalam Extra" w:hAnsi="BRH Malayalam Extra" w:cs="BRH Malayalam Extra"/>
+                <w:sz w:val="32"/>
+                <w:szCs w:val="40"/>
+                <w:lang w:val="it-IT"/>
+              </w:rPr>
+              <w:t>Z¡r¡— | G</w:t>
+            </w:r>
+            <w:r>
+              <w:rPr>
+                <w:rFonts w:ascii="BRH Malayalam Extra" w:hAnsi="BRH Malayalam Extra" w:cs="BRH Malayalam Extra"/>
+                <w:sz w:val="26"/>
+                <w:szCs w:val="40"/>
+                <w:lang w:val="it-IT"/>
+              </w:rPr>
+              <w:t>–</w:t>
+            </w:r>
+            <w:r>
+              <w:rPr>
+                <w:rFonts w:ascii="BRH Malayalam Extra" w:hAnsi="BRH Malayalam Extra" w:cs="BRH Malayalam Extra"/>
+                <w:sz w:val="32"/>
+                <w:szCs w:val="40"/>
+                <w:lang w:val="it-IT"/>
+              </w:rPr>
+              <w:t xml:space="preserve">p | </w:t>
+            </w:r>
           </w:p>
           <w:p>
             <w:pPr>
@@ -28937,6 +29012,193 @@
                 <w:lang w:val="it-IT"/>
               </w:rPr>
             </w:pPr>
+            <w:r>
+              <w:rPr>
+                <w:rFonts w:ascii="BRH Malayalam Extra" w:hAnsi="BRH Malayalam Extra" w:cs="BRH Malayalam Extra"/>
+                <w:sz w:val="32"/>
+                <w:szCs w:val="40"/>
+                <w:lang w:val="it-IT"/>
+              </w:rPr>
+              <w:t>E</w:t>
+            </w:r>
+            <w:r>
+              <w:rPr>
+                <w:rFonts w:ascii="BRH Malayalam Extra" w:hAnsi="BRH Malayalam Extra" w:cs="BRH Malayalam Extra"/>
+                <w:sz w:val="26"/>
+                <w:szCs w:val="40"/>
+                <w:lang w:val="it-IT"/>
+              </w:rPr>
+              <w:t>–</w:t>
+            </w:r>
+            <w:r>
+              <w:rPr>
+                <w:rFonts w:ascii="BRH Malayalam Extra" w:hAnsi="BRH Malayalam Extra" w:cs="BRH Malayalam Extra"/>
+                <w:sz w:val="32"/>
+                <w:szCs w:val="40"/>
+                <w:lang w:val="it-IT"/>
+              </w:rPr>
+              <w:t>Zp— E</w:t>
+            </w:r>
+            <w:r>
+              <w:rPr>
+                <w:rFonts w:ascii="BRH Malayalam Extra" w:hAnsi="BRH Malayalam Extra" w:cs="BRH Malayalam Extra"/>
+                <w:sz w:val="26"/>
+                <w:szCs w:val="40"/>
+                <w:lang w:val="it-IT"/>
+              </w:rPr>
+              <w:t>–</w:t>
+            </w:r>
+            <w:r>
+              <w:rPr>
+                <w:rFonts w:ascii="BRH Malayalam Extra" w:hAnsi="BRH Malayalam Extra" w:cs="BRH Malayalam Extra"/>
+                <w:sz w:val="32"/>
+                <w:szCs w:val="40"/>
+                <w:lang w:val="it-IT"/>
+              </w:rPr>
+              <w:t>Z¡</w:t>
+            </w:r>
+            <w:r>
+              <w:rPr>
+                <w:rFonts w:ascii="BRH Malayalam Extra" w:hAnsi="BRH Malayalam Extra" w:cs="BRH Malayalam Extra"/>
+                <w:sz w:val="32"/>
+                <w:szCs w:val="40"/>
+                <w:highlight w:val="green"/>
+                <w:lang w:val="it-IT"/>
+              </w:rPr>
+              <w:t>rû</w:t>
+            </w:r>
+            <w:r>
+              <w:rPr>
+                <w:rFonts w:ascii="BRH Malayalam Extra" w:hAnsi="BRH Malayalam Extra" w:cs="BRH Malayalam Extra"/>
+                <w:sz w:val="26"/>
+                <w:szCs w:val="40"/>
+                <w:highlight w:val="green"/>
+                <w:lang w:val="it-IT"/>
+              </w:rPr>
+              <w:t>–</w:t>
+            </w:r>
+            <w:r>
+              <w:rPr>
+                <w:rFonts w:ascii="BRH Malayalam Extra" w:hAnsi="BRH Malayalam Extra" w:cs="BRH Malayalam Extra"/>
+                <w:sz w:val="32"/>
+                <w:szCs w:val="40"/>
+                <w:highlight w:val="green"/>
+                <w:lang w:val="it-IT"/>
+              </w:rPr>
+              <w:t>ª</w:t>
+            </w:r>
+            <w:r>
+              <w:rPr>
+                <w:rFonts w:ascii="BRH Malayalam Extra" w:hAnsi="BRH Malayalam Extra" w:cs="BRH Malayalam Extra"/>
+                <w:sz w:val="32"/>
+                <w:szCs w:val="40"/>
+                <w:lang w:val="it-IT"/>
+              </w:rPr>
+              <w:t>Z¡</w:t>
+            </w:r>
+            <w:r>
+              <w:rPr>
+                <w:rFonts w:ascii="BRH Malayalam Extra" w:hAnsi="BRH Malayalam Extra" w:cs="BRH Malayalam Extra"/>
+                <w:sz w:val="32"/>
+                <w:szCs w:val="40"/>
+                <w:highlight w:val="green"/>
+                <w:lang w:val="it-IT"/>
+              </w:rPr>
+              <w:t xml:space="preserve"> rû</w:t>
+            </w:r>
+            <w:r>
+              <w:rPr>
+                <w:rFonts w:ascii="BRH Malayalam Extra" w:hAnsi="BRH Malayalam Extra" w:cs="BRH Malayalam Extra"/>
+                <w:sz w:val="26"/>
+                <w:szCs w:val="40"/>
+                <w:highlight w:val="green"/>
+                <w:lang w:val="it-IT"/>
+              </w:rPr>
+              <w:t>–</w:t>
+            </w:r>
+            <w:r>
+              <w:rPr>
+                <w:rFonts w:ascii="BRH Malayalam Extra" w:hAnsi="BRH Malayalam Extra" w:cs="BRH Malayalam Extra"/>
+                <w:sz w:val="32"/>
+                <w:szCs w:val="40"/>
+                <w:highlight w:val="green"/>
+                <w:lang w:val="it-IT"/>
+              </w:rPr>
+              <w:t>ª</w:t>
+            </w:r>
+            <w:r>
+              <w:rPr>
+                <w:rFonts w:ascii="BRH Malayalam Extra" w:hAnsi="BRH Malayalam Extra" w:cs="BRH Malayalam Extra"/>
+                <w:sz w:val="32"/>
+                <w:szCs w:val="40"/>
+                <w:highlight w:val="green"/>
+                <w:lang w:val="it-IT"/>
+              </w:rPr>
+              <w:t>Zp</w:t>
+            </w:r>
+            <w:r>
+              <w:rPr>
+                <w:rFonts w:ascii="BRH Malayalam Extra" w:hAnsi="BRH Malayalam Extra" w:cs="BRH Malayalam Extra"/>
+                <w:sz w:val="32"/>
+                <w:szCs w:val="40"/>
+                <w:lang w:val="it-IT"/>
+              </w:rPr>
+              <w:t>— E</w:t>
+            </w:r>
+            <w:r>
+              <w:rPr>
+                <w:rFonts w:ascii="BRH Malayalam Extra" w:hAnsi="BRH Malayalam Extra" w:cs="BRH Malayalam Extra"/>
+                <w:sz w:val="26"/>
+                <w:szCs w:val="40"/>
+                <w:lang w:val="it-IT"/>
+              </w:rPr>
+              <w:t>–</w:t>
+            </w:r>
+            <w:r>
+              <w:rPr>
+                <w:rFonts w:ascii="BRH Malayalam Extra" w:hAnsi="BRH Malayalam Extra" w:cs="BRH Malayalam Extra"/>
+                <w:sz w:val="32"/>
+                <w:szCs w:val="40"/>
+                <w:lang w:val="it-IT"/>
+              </w:rPr>
+              <w:t>Zp— E</w:t>
+            </w:r>
+            <w:r>
+              <w:rPr>
+                <w:rFonts w:ascii="BRH Malayalam Extra" w:hAnsi="BRH Malayalam Extra" w:cs="BRH Malayalam Extra"/>
+                <w:sz w:val="26"/>
+                <w:szCs w:val="40"/>
+                <w:lang w:val="it-IT"/>
+              </w:rPr>
+              <w:t>–</w:t>
+            </w:r>
+            <w:r>
+              <w:rPr>
+                <w:rFonts w:ascii="BRH Malayalam Extra" w:hAnsi="BRH Malayalam Extra" w:cs="BRH Malayalam Extra"/>
+                <w:sz w:val="32"/>
+                <w:szCs w:val="40"/>
+                <w:lang w:val="it-IT"/>
+              </w:rPr>
+              <w:t>Z¡¥rû</w:t>
+            </w:r>
+            <w:r>
+              <w:rPr>
+                <w:rFonts w:ascii="BRH Malayalam Extra" w:hAnsi="BRH Malayalam Extra" w:cs="BRH Malayalam Extra"/>
+                <w:sz w:val="26"/>
+                <w:szCs w:val="40"/>
+                <w:lang w:val="it-IT"/>
+              </w:rPr>
+              <w:t>–</w:t>
+            </w:r>
+            <w:r>
+              <w:rPr>
+                <w:rFonts w:ascii="BRH Malayalam Extra" w:hAnsi="BRH Malayalam Extra" w:cs="BRH Malayalam Extra"/>
+                <w:sz w:val="32"/>
+                <w:szCs w:val="40"/>
+                <w:lang w:val="it-IT"/>
+              </w:rPr>
+              <w:t xml:space="preserve">¤¤pp </w:t>
+            </w:r>
           </w:p>
           <w:p>
             <w:pPr>
@@ -28954,142 +29216,51 @@
             </w:pPr>
             <w:r>
               <w:rPr>
-                <w:rFonts w:cs="BRH Malayalam Extra"/>
-                <w:szCs w:val="40"/>
-                <w:lang w:val="it-IT"/>
-              </w:rPr>
-              <w:t>1</w:t>
-            </w:r>
-            <w:r>
-              <w:rPr>
-                <w:rFonts w:ascii="BRH Malayalam Extra" w:hAnsi="BRH Malayalam Extra" w:cs="BRH Malayalam Extra"/>
-                <w:sz w:val="32"/>
-                <w:szCs w:val="40"/>
-                <w:lang w:val="it-IT"/>
-              </w:rPr>
-              <w:t>)</w:t>
-            </w:r>
-            <w:r>
-              <w:rPr>
-                <w:rFonts w:cs="BRH Malayalam Extra"/>
-                <w:szCs w:val="40"/>
-                <w:lang w:val="it-IT"/>
-              </w:rPr>
-              <w:t xml:space="preserve">  </w:t>
-            </w:r>
-            <w:bookmarkStart w:id="3" w:name="_Hlk128842256"/>
-            <w:r>
-              <w:rPr>
-                <w:rFonts w:cs="BRH Malayalam Extra"/>
-                <w:szCs w:val="40"/>
-                <w:lang w:val="it-IT"/>
-              </w:rPr>
-              <w:t>1</w:t>
-            </w:r>
-            <w:r>
-              <w:rPr>
-                <w:rFonts w:ascii="BRH Malayalam Extra" w:hAnsi="BRH Malayalam Extra" w:cs="BRH Malayalam Extra"/>
-                <w:sz w:val="32"/>
-                <w:szCs w:val="40"/>
-                <w:lang w:val="it-IT"/>
-              </w:rPr>
-              <w:t>.</w:t>
-            </w:r>
-            <w:r>
-              <w:rPr>
-                <w:rFonts w:cs="BRH Malayalam Extra"/>
-                <w:szCs w:val="40"/>
-                <w:lang w:val="it-IT"/>
-              </w:rPr>
-              <w:t>5</w:t>
-            </w:r>
-            <w:r>
-              <w:rPr>
-                <w:rFonts w:ascii="BRH Malayalam Extra" w:hAnsi="BRH Malayalam Extra" w:cs="BRH Malayalam Extra"/>
-                <w:sz w:val="32"/>
-                <w:szCs w:val="40"/>
-                <w:lang w:val="it-IT"/>
-              </w:rPr>
-              <w:t>.</w:t>
-            </w:r>
-            <w:r>
-              <w:rPr>
-                <w:rFonts w:cs="BRH Malayalam Extra"/>
-                <w:szCs w:val="40"/>
-                <w:lang w:val="it-IT"/>
-              </w:rPr>
-              <w:t>7</w:t>
-            </w:r>
-            <w:r>
-              <w:rPr>
-                <w:rFonts w:ascii="BRH Malayalam Extra" w:hAnsi="BRH Malayalam Extra" w:cs="BRH Malayalam Extra"/>
-                <w:sz w:val="32"/>
-                <w:szCs w:val="40"/>
-                <w:lang w:val="it-IT"/>
-              </w:rPr>
-              <w:t>.</w:t>
-            </w:r>
-            <w:r>
-              <w:rPr>
-                <w:rFonts w:cs="BRH Malayalam Extra"/>
-                <w:szCs w:val="40"/>
-                <w:lang w:val="it-IT"/>
-              </w:rPr>
-              <w:t>3</w:t>
-            </w:r>
-            <w:r>
-              <w:rPr>
-                <w:rFonts w:ascii="BRH Malayalam Extra" w:hAnsi="BRH Malayalam Extra" w:cs="BRH Malayalam Extra"/>
-                <w:sz w:val="32"/>
-                <w:szCs w:val="40"/>
-                <w:lang w:val="it-IT"/>
-              </w:rPr>
-              <w:t>(</w:t>
-            </w:r>
-            <w:r>
-              <w:rPr>
-                <w:rFonts w:cs="BRH Malayalam Extra"/>
-                <w:szCs w:val="40"/>
-                <w:lang w:val="it-IT"/>
-              </w:rPr>
-              <w:t>1</w:t>
-            </w:r>
-            <w:r>
-              <w:rPr>
-                <w:rFonts w:ascii="BRH Malayalam Extra" w:hAnsi="BRH Malayalam Extra" w:cs="BRH Malayalam Extra"/>
-                <w:sz w:val="32"/>
-                <w:szCs w:val="40"/>
-                <w:lang w:val="it-IT"/>
-              </w:rPr>
-              <w:t xml:space="preserve">)-  </w:t>
-            </w:r>
-            <w:bookmarkEnd w:id="3"/>
-            <w:r>
-              <w:rPr>
-                <w:rFonts w:ascii="BRH Malayalam Extra" w:hAnsi="BRH Malayalam Extra" w:cs="BRH Malayalam Extra"/>
-                <w:sz w:val="32"/>
-                <w:szCs w:val="40"/>
-                <w:lang w:val="it-IT"/>
-              </w:rPr>
-              <w:t>E</w:t>
+                <w:rFonts w:ascii="BRH Malayalam Extra" w:hAnsi="BRH Malayalam Extra" w:cs="BRH Malayalam Extra"/>
+                <w:sz w:val="32"/>
+                <w:szCs w:val="40"/>
+                <w:lang w:val="it-IT"/>
+              </w:rPr>
+              <w:t>ªZ¡</w:t>
+            </w:r>
+            <w:r>
+              <w:rPr>
+                <w:rFonts w:ascii="BRH Malayalam Extra" w:hAnsi="BRH Malayalam Extra" w:cs="BRH Malayalam Extra"/>
+                <w:sz w:val="32"/>
+                <w:szCs w:val="40"/>
+                <w:highlight w:val="green"/>
+                <w:lang w:val="it-IT"/>
+              </w:rPr>
+              <w:t xml:space="preserve"> rû</w:t>
             </w:r>
             <w:r>
               <w:rPr>
                 <w:rFonts w:ascii="BRH Malayalam Extra" w:hAnsi="BRH Malayalam Extra" w:cs="BRH Malayalam Extra"/>
                 <w:sz w:val="26"/>
                 <w:szCs w:val="40"/>
-                <w:lang w:val="it-IT"/>
-              </w:rPr>
-              <w:t>–</w:t>
-            </w:r>
-            <w:r>
-              <w:rPr>
-                <w:rFonts w:ascii="BRH Malayalam Extra" w:hAnsi="BRH Malayalam Extra" w:cs="BRH Malayalam Extra"/>
-                <w:sz w:val="32"/>
-                <w:szCs w:val="40"/>
-                <w:lang w:val="it-IT"/>
-              </w:rPr>
-              <w:t>Zp—J | E</w:t>
+                <w:highlight w:val="green"/>
+                <w:lang w:val="it-IT"/>
+              </w:rPr>
+              <w:t>–</w:t>
+            </w:r>
+            <w:r>
+              <w:rPr>
+                <w:rFonts w:ascii="BRH Malayalam Extra" w:hAnsi="BRH Malayalam Extra" w:cs="BRH Malayalam Extra"/>
+                <w:sz w:val="32"/>
+                <w:szCs w:val="40"/>
+                <w:highlight w:val="green"/>
+                <w:lang w:val="it-IT"/>
+              </w:rPr>
+              <w:t>ª</w:t>
+            </w:r>
+            <w:r>
+              <w:rPr>
+                <w:rFonts w:ascii="BRH Malayalam Extra" w:hAnsi="BRH Malayalam Extra" w:cs="BRH Malayalam Extra"/>
+                <w:sz w:val="32"/>
+                <w:szCs w:val="40"/>
+                <w:lang w:val="it-IT"/>
+              </w:rPr>
+              <w:t>Zp— E</w:t>
             </w:r>
             <w:r>
               <w:rPr>
@@ -29107,7 +29278,25 @@
                 <w:szCs w:val="40"/>
                 <w:lang w:val="it-IT"/>
               </w:rPr>
-              <w:t>Z¡r¡— | G</w:t>
+              <w:t>Zp— E</w:t>
+            </w:r>
+            <w:r>
+              <w:rPr>
+                <w:rFonts w:ascii="BRH Malayalam Extra" w:hAnsi="BRH Malayalam Extra" w:cs="BRH Malayalam Extra"/>
+                <w:sz w:val="26"/>
+                <w:szCs w:val="40"/>
+                <w:lang w:val="it-IT"/>
+              </w:rPr>
+              <w:t>–</w:t>
+            </w:r>
+            <w:r>
+              <w:rPr>
+                <w:rFonts w:ascii="BRH Malayalam Extra" w:hAnsi="BRH Malayalam Extra" w:cs="BRH Malayalam Extra"/>
+                <w:sz w:val="32"/>
+                <w:szCs w:val="40"/>
+                <w:lang w:val="it-IT"/>
+              </w:rPr>
+              <w:t>Z¡¥rû</w:t>
             </w:r>
             <w:r>
               <w:rPr>
@@ -29144,329 +29333,11 @@
             </w:pPr>
             <w:r>
               <w:rPr>
-                <w:rFonts w:ascii="BRH Malayalam Extra" w:hAnsi="BRH Malayalam Extra" w:cs="BRH Malayalam Extra"/>
-                <w:sz w:val="32"/>
-                <w:szCs w:val="40"/>
-                <w:lang w:val="it-IT"/>
-              </w:rPr>
-              <w:t>E</w:t>
-            </w:r>
-            <w:r>
-              <w:rPr>
-                <w:rFonts w:ascii="BRH Malayalam Extra" w:hAnsi="BRH Malayalam Extra" w:cs="BRH Malayalam Extra"/>
-                <w:sz w:val="26"/>
-                <w:szCs w:val="40"/>
-                <w:lang w:val="it-IT"/>
-              </w:rPr>
-              <w:t>–</w:t>
-            </w:r>
-            <w:r>
-              <w:rPr>
-                <w:rFonts w:ascii="BRH Malayalam Extra" w:hAnsi="BRH Malayalam Extra" w:cs="BRH Malayalam Extra"/>
-                <w:sz w:val="32"/>
-                <w:szCs w:val="40"/>
-                <w:lang w:val="it-IT"/>
-              </w:rPr>
-              <w:t>Zp— E</w:t>
-            </w:r>
-            <w:r>
-              <w:rPr>
-                <w:rFonts w:ascii="BRH Malayalam Extra" w:hAnsi="BRH Malayalam Extra" w:cs="BRH Malayalam Extra"/>
-                <w:sz w:val="26"/>
-                <w:szCs w:val="40"/>
-                <w:lang w:val="it-IT"/>
-              </w:rPr>
-              <w:t>–</w:t>
-            </w:r>
-            <w:r>
-              <w:rPr>
-                <w:rFonts w:ascii="BRH Malayalam Extra" w:hAnsi="BRH Malayalam Extra" w:cs="BRH Malayalam Extra"/>
-                <w:sz w:val="32"/>
-                <w:szCs w:val="40"/>
-                <w:lang w:val="it-IT"/>
-              </w:rPr>
-              <w:t>Z¡</w:t>
-            </w:r>
-            <w:r>
-              <w:rPr>
-                <w:rFonts w:ascii="BRH Malayalam Extra" w:hAnsi="BRH Malayalam Extra" w:cs="BRH Malayalam Extra"/>
-                <w:sz w:val="32"/>
-                <w:szCs w:val="40"/>
-                <w:highlight w:val="green"/>
-                <w:lang w:val="it-IT"/>
-              </w:rPr>
-              <w:t>rû</w:t>
-            </w:r>
-            <w:r>
-              <w:rPr>
-                <w:rFonts w:ascii="BRH Malayalam Extra" w:hAnsi="BRH Malayalam Extra" w:cs="BRH Malayalam Extra"/>
-                <w:sz w:val="26"/>
-                <w:szCs w:val="40"/>
-                <w:highlight w:val="green"/>
-                <w:lang w:val="it-IT"/>
-              </w:rPr>
-              <w:t>–</w:t>
-            </w:r>
-            <w:r>
-              <w:rPr>
-                <w:rFonts w:ascii="BRH Malayalam Extra" w:hAnsi="BRH Malayalam Extra" w:cs="BRH Malayalam Extra"/>
-                <w:sz w:val="32"/>
-                <w:szCs w:val="40"/>
-                <w:highlight w:val="green"/>
-                <w:lang w:val="it-IT"/>
-              </w:rPr>
-              <w:t>ª</w:t>
-            </w:r>
-            <w:r>
-              <w:rPr>
-                <w:rFonts w:ascii="BRH Malayalam Extra" w:hAnsi="BRH Malayalam Extra" w:cs="BRH Malayalam Extra"/>
-                <w:sz w:val="32"/>
-                <w:szCs w:val="40"/>
-                <w:lang w:val="it-IT"/>
-              </w:rPr>
-              <w:t>Z¡</w:t>
-            </w:r>
-            <w:r>
-              <w:rPr>
-                <w:rFonts w:ascii="BRH Malayalam Extra" w:hAnsi="BRH Malayalam Extra" w:cs="BRH Malayalam Extra"/>
-                <w:sz w:val="32"/>
-                <w:szCs w:val="40"/>
-                <w:highlight w:val="green"/>
-                <w:lang w:val="it-IT"/>
-              </w:rPr>
-              <w:t xml:space="preserve"> rû</w:t>
-            </w:r>
-            <w:r>
-              <w:rPr>
-                <w:rFonts w:ascii="BRH Malayalam Extra" w:hAnsi="BRH Malayalam Extra" w:cs="BRH Malayalam Extra"/>
-                <w:sz w:val="26"/>
-                <w:szCs w:val="40"/>
-                <w:highlight w:val="green"/>
-                <w:lang w:val="it-IT"/>
-              </w:rPr>
-              <w:t>–</w:t>
-            </w:r>
-            <w:r>
-              <w:rPr>
-                <w:rFonts w:ascii="BRH Malayalam Extra" w:hAnsi="BRH Malayalam Extra" w:cs="BRH Malayalam Extra"/>
-                <w:sz w:val="32"/>
-                <w:szCs w:val="40"/>
-                <w:highlight w:val="green"/>
-                <w:lang w:val="it-IT"/>
-              </w:rPr>
-              <w:t>ª</w:t>
-            </w:r>
-            <w:r>
-              <w:rPr>
-                <w:rFonts w:ascii="BRH Malayalam Extra" w:hAnsi="BRH Malayalam Extra" w:cs="BRH Malayalam Extra"/>
-                <w:sz w:val="32"/>
-                <w:szCs w:val="40"/>
-                <w:highlight w:val="green"/>
-                <w:lang w:val="it-IT"/>
-              </w:rPr>
-              <w:t>Zp</w:t>
-            </w:r>
-            <w:r>
-              <w:rPr>
-                <w:rFonts w:ascii="BRH Malayalam Extra" w:hAnsi="BRH Malayalam Extra" w:cs="BRH Malayalam Extra"/>
-                <w:sz w:val="32"/>
-                <w:szCs w:val="40"/>
-                <w:lang w:val="it-IT"/>
-              </w:rPr>
-              <w:t>— E</w:t>
-            </w:r>
-            <w:r>
-              <w:rPr>
-                <w:rFonts w:ascii="BRH Malayalam Extra" w:hAnsi="BRH Malayalam Extra" w:cs="BRH Malayalam Extra"/>
-                <w:sz w:val="26"/>
-                <w:szCs w:val="40"/>
-                <w:lang w:val="it-IT"/>
-              </w:rPr>
-              <w:t>–</w:t>
-            </w:r>
-            <w:r>
-              <w:rPr>
-                <w:rFonts w:ascii="BRH Malayalam Extra" w:hAnsi="BRH Malayalam Extra" w:cs="BRH Malayalam Extra"/>
-                <w:sz w:val="32"/>
-                <w:szCs w:val="40"/>
-                <w:lang w:val="it-IT"/>
-              </w:rPr>
-              <w:t>Zp— E</w:t>
-            </w:r>
-            <w:r>
-              <w:rPr>
-                <w:rFonts w:ascii="BRH Malayalam Extra" w:hAnsi="BRH Malayalam Extra" w:cs="BRH Malayalam Extra"/>
-                <w:sz w:val="26"/>
-                <w:szCs w:val="40"/>
-                <w:lang w:val="it-IT"/>
-              </w:rPr>
-              <w:t>–</w:t>
-            </w:r>
-            <w:r>
-              <w:rPr>
-                <w:rFonts w:ascii="BRH Malayalam Extra" w:hAnsi="BRH Malayalam Extra" w:cs="BRH Malayalam Extra"/>
-                <w:sz w:val="32"/>
-                <w:szCs w:val="40"/>
-                <w:lang w:val="it-IT"/>
-              </w:rPr>
-              <w:t>Z¡¥rû</w:t>
-            </w:r>
-            <w:r>
-              <w:rPr>
-                <w:rFonts w:ascii="BRH Malayalam Extra" w:hAnsi="BRH Malayalam Extra" w:cs="BRH Malayalam Extra"/>
-                <w:sz w:val="26"/>
-                <w:szCs w:val="40"/>
-                <w:lang w:val="it-IT"/>
-              </w:rPr>
-              <w:t>–</w:t>
-            </w:r>
-            <w:r>
-              <w:rPr>
-                <w:rFonts w:ascii="BRH Malayalam Extra" w:hAnsi="BRH Malayalam Extra" w:cs="BRH Malayalam Extra"/>
-                <w:sz w:val="32"/>
-                <w:szCs w:val="40"/>
-                <w:lang w:val="it-IT"/>
-              </w:rPr>
-              <w:t xml:space="preserve">¤¤pp </w:t>
-            </w:r>
-          </w:p>
-          <w:p>
-            <w:pPr>
-              <w:widowControl w:val="0"/>
-              <w:autoSpaceDE w:val="0"/>
-              <w:autoSpaceDN w:val="0"/>
-              <w:adjustRightInd w:val="0"/>
-              <w:spacing w:before="0" w:line="240" w:lineRule="auto"/>
-              <w:rPr>
-                <w:rFonts w:ascii="BRH Malayalam Extra" w:hAnsi="BRH Malayalam Extra" w:cs="BRH Malayalam Extra"/>
-                <w:sz w:val="32"/>
-                <w:szCs w:val="40"/>
-                <w:lang w:val="it-IT"/>
-              </w:rPr>
-            </w:pPr>
-            <w:r>
-              <w:rPr>
-                <w:rFonts w:ascii="BRH Malayalam Extra" w:hAnsi="BRH Malayalam Extra" w:cs="BRH Malayalam Extra"/>
-                <w:sz w:val="32"/>
-                <w:szCs w:val="40"/>
-                <w:lang w:val="it-IT"/>
-              </w:rPr>
-              <w:t>ªZ¡</w:t>
-            </w:r>
-            <w:r>
-              <w:rPr>
-                <w:rFonts w:ascii="BRH Malayalam Extra" w:hAnsi="BRH Malayalam Extra" w:cs="BRH Malayalam Extra"/>
-                <w:sz w:val="32"/>
-                <w:szCs w:val="40"/>
-                <w:highlight w:val="green"/>
-                <w:lang w:val="it-IT"/>
-              </w:rPr>
-              <w:t xml:space="preserve"> rû</w:t>
-            </w:r>
-            <w:r>
-              <w:rPr>
-                <w:rFonts w:ascii="BRH Malayalam Extra" w:hAnsi="BRH Malayalam Extra" w:cs="BRH Malayalam Extra"/>
-                <w:sz w:val="26"/>
-                <w:szCs w:val="40"/>
-                <w:highlight w:val="green"/>
-                <w:lang w:val="it-IT"/>
-              </w:rPr>
-              <w:t>–</w:t>
-            </w:r>
-            <w:r>
-              <w:rPr>
-                <w:rFonts w:ascii="BRH Malayalam Extra" w:hAnsi="BRH Malayalam Extra" w:cs="BRH Malayalam Extra"/>
-                <w:sz w:val="32"/>
-                <w:szCs w:val="40"/>
-                <w:highlight w:val="green"/>
-                <w:lang w:val="it-IT"/>
-              </w:rPr>
-              <w:t>ª</w:t>
-            </w:r>
-            <w:r>
-              <w:rPr>
-                <w:rFonts w:ascii="BRH Malayalam Extra" w:hAnsi="BRH Malayalam Extra" w:cs="BRH Malayalam Extra"/>
-                <w:sz w:val="32"/>
-                <w:szCs w:val="40"/>
-                <w:lang w:val="it-IT"/>
-              </w:rPr>
-              <w:t>Zp— E</w:t>
-            </w:r>
-            <w:r>
-              <w:rPr>
-                <w:rFonts w:ascii="BRH Malayalam Extra" w:hAnsi="BRH Malayalam Extra" w:cs="BRH Malayalam Extra"/>
-                <w:sz w:val="26"/>
-                <w:szCs w:val="40"/>
-                <w:lang w:val="it-IT"/>
-              </w:rPr>
-              <w:t>–</w:t>
-            </w:r>
-            <w:r>
-              <w:rPr>
-                <w:rFonts w:ascii="BRH Malayalam Extra" w:hAnsi="BRH Malayalam Extra" w:cs="BRH Malayalam Extra"/>
-                <w:sz w:val="32"/>
-                <w:szCs w:val="40"/>
-                <w:lang w:val="it-IT"/>
-              </w:rPr>
-              <w:t>Zp— E</w:t>
-            </w:r>
-            <w:r>
-              <w:rPr>
-                <w:rFonts w:ascii="BRH Malayalam Extra" w:hAnsi="BRH Malayalam Extra" w:cs="BRH Malayalam Extra"/>
-                <w:sz w:val="26"/>
-                <w:szCs w:val="40"/>
-                <w:lang w:val="it-IT"/>
-              </w:rPr>
-              <w:t>–</w:t>
-            </w:r>
-            <w:r>
-              <w:rPr>
-                <w:rFonts w:ascii="BRH Malayalam Extra" w:hAnsi="BRH Malayalam Extra" w:cs="BRH Malayalam Extra"/>
-                <w:sz w:val="32"/>
-                <w:szCs w:val="40"/>
-                <w:lang w:val="it-IT"/>
-              </w:rPr>
-              <w:t>Z¡¥rû</w:t>
-            </w:r>
-            <w:r>
-              <w:rPr>
-                <w:rFonts w:ascii="BRH Malayalam Extra" w:hAnsi="BRH Malayalam Extra" w:cs="BRH Malayalam Extra"/>
-                <w:sz w:val="26"/>
-                <w:szCs w:val="40"/>
-                <w:lang w:val="it-IT"/>
-              </w:rPr>
-              <w:t>–</w:t>
-            </w:r>
-            <w:r>
-              <w:rPr>
-                <w:rFonts w:ascii="BRH Malayalam Extra" w:hAnsi="BRH Malayalam Extra" w:cs="BRH Malayalam Extra"/>
-                <w:sz w:val="32"/>
-                <w:szCs w:val="40"/>
-                <w:lang w:val="it-IT"/>
-              </w:rPr>
-              <w:t xml:space="preserve">p | </w:t>
-            </w:r>
-          </w:p>
-          <w:p>
-            <w:pPr>
-              <w:widowControl w:val="0"/>
-              <w:autoSpaceDE w:val="0"/>
-              <w:autoSpaceDN w:val="0"/>
-              <w:adjustRightInd w:val="0"/>
-              <w:spacing w:before="0" w:line="240" w:lineRule="auto"/>
-              <w:rPr>
-                <w:rFonts w:ascii="BRH Malayalam Extra" w:hAnsi="BRH Malayalam Extra" w:cs="BRH Malayalam Extra"/>
-                <w:sz w:val="32"/>
-                <w:szCs w:val="40"/>
-                <w:lang w:val="it-IT"/>
-              </w:rPr>
-            </w:pPr>
-            <w:r>
-              <w:rPr>
-                <w:rFonts w:cs="BRH Malayalam Extra"/>
-                <w:szCs w:val="40"/>
-                <w:lang w:val="it-IT"/>
-              </w:rPr>
+                <w:rFonts w:cs="BRH Malayalam Extra"/>
+                <w:szCs w:val="40"/>
+                <w:lang w:val="it-IT"/>
+              </w:rPr>
+              <w:lastRenderedPageBreak/>
               <w:t>2</w:t>
             </w:r>
             <w:r>
@@ -30632,7 +30503,6 @@
                 <w:highlight w:val="yellow"/>
                 <w:lang w:val="it-IT"/>
               </w:rPr>
-              <w:lastRenderedPageBreak/>
               <w:t>jx</w:t>
             </w:r>
             <w:r>
@@ -30985,7 +30855,6 @@
                 <w:rFonts w:cs="BRH Malayalam Extra"/>
                 <w:szCs w:val="40"/>
               </w:rPr>
-              <w:lastRenderedPageBreak/>
               <w:t>5</w:t>
             </w:r>
             <w:r>
@@ -31714,7 +31583,6 @@
                 <w:szCs w:val="40"/>
                 <w:highlight w:val="green"/>
               </w:rPr>
-              <w:lastRenderedPageBreak/>
               <w:t>jx</w:t>
             </w:r>
             <w:r>
@@ -32120,7 +31988,6 @@
                 <w:rFonts w:cs="BRH Malayalam Extra"/>
                 <w:szCs w:val="40"/>
               </w:rPr>
-              <w:lastRenderedPageBreak/>
               <w:t>48</w:t>
             </w:r>
             <w:r>
@@ -32486,6 +32353,7 @@
                 <w:sz w:val="32"/>
                 <w:szCs w:val="40"/>
               </w:rPr>
+              <w:lastRenderedPageBreak/>
               <w:t>põ¡—ræy ¥i</w:t>
             </w:r>
             <w:r>
@@ -32865,6 +32733,7 @@
                 <w:rFonts w:cs="BRH Malayalam Extra"/>
                 <w:szCs w:val="40"/>
               </w:rPr>
+              <w:lastRenderedPageBreak/>
               <w:t>48</w:t>
             </w:r>
             <w:r>
@@ -33222,6 +33091,7 @@
                 <w:sz w:val="32"/>
                 <w:szCs w:val="40"/>
               </w:rPr>
+              <w:lastRenderedPageBreak/>
               <w:t>põ¡—ræy ¥i</w:t>
             </w:r>
             <w:r>
@@ -33585,6 +33455,7 @@
                 <w:rFonts w:cs="BRH Malayalam Extra"/>
                 <w:szCs w:val="40"/>
               </w:rPr>
+              <w:lastRenderedPageBreak/>
               <w:t>76</w:t>
             </w:r>
             <w:r>
@@ -34864,7 +34735,7 @@
       </w:tr>
       <w:tr>
         <w:trPr>
-          <w:trHeight w:val="1701"/>
+          <w:trHeight w:val="557"/>
         </w:trPr>
         <w:tc>
           <w:tcPr>
@@ -34890,7 +34761,6 @@
                 <w:szCs w:val="40"/>
                 <w:lang w:val="it-IT"/>
               </w:rPr>
-              <w:lastRenderedPageBreak/>
               <w:t>40</w:t>
             </w:r>
             <w:r>
@@ -35704,7 +35574,17 @@
                 <w:szCs w:val="40"/>
                 <w:lang w:val="it-IT"/>
               </w:rPr>
-              <w:t xml:space="preserve">Àûx Kxix(³§—) AK¡ªpZ | </w:t>
+              <w:t xml:space="preserve">Àûx </w:t>
+            </w:r>
+            <w:r>
+              <w:rPr>
+                <w:rFonts w:ascii="BRH Malayalam Extra" w:hAnsi="BRH Malayalam Extra" w:cs="BRH Malayalam Extra"/>
+                <w:sz w:val="32"/>
+                <w:szCs w:val="40"/>
+                <w:lang w:val="it-IT"/>
+              </w:rPr>
+              <w:lastRenderedPageBreak/>
+              <w:t xml:space="preserve">Kxix(³§—) AK¡ªpZ | </w:t>
             </w:r>
           </w:p>
         </w:tc>
@@ -35732,6 +35612,7 @@
                 <w:szCs w:val="40"/>
                 <w:lang w:val="it-IT"/>
               </w:rPr>
+              <w:lastRenderedPageBreak/>
               <w:t>40</w:t>
             </w:r>
             <w:r>
@@ -36521,7 +36402,17 @@
                 <w:szCs w:val="40"/>
                 <w:lang w:val="it-IT"/>
               </w:rPr>
-              <w:t xml:space="preserve">Àûx Kxix(³§—) AK¡ªpZ | </w:t>
+              <w:t xml:space="preserve">Àûx </w:t>
+            </w:r>
+            <w:r>
+              <w:rPr>
+                <w:rFonts w:ascii="BRH Malayalam Extra" w:hAnsi="BRH Malayalam Extra" w:cs="BRH Malayalam Extra"/>
+                <w:sz w:val="32"/>
+                <w:szCs w:val="40"/>
+                <w:lang w:val="it-IT"/>
+              </w:rPr>
+              <w:lastRenderedPageBreak/>
+              <w:t xml:space="preserve">Kxix(³§—) AK¡ªpZ | </w:t>
             </w:r>
           </w:p>
         </w:tc>
@@ -36552,6 +36443,7 @@
                 <w:rFonts w:cs="BRH Malayalam Extra"/>
                 <w:szCs w:val="40"/>
               </w:rPr>
+              <w:lastRenderedPageBreak/>
               <w:t>7</w:t>
             </w:r>
             <w:r>
@@ -37644,16 +37536,7 @@
                 <w:sz w:val="32"/>
                 <w:szCs w:val="40"/>
               </w:rPr>
-              <w:t xml:space="preserve">— </w:t>
-            </w:r>
-            <w:r>
-              <w:rPr>
-                <w:rFonts w:ascii="BRH Malayalam Extra" w:hAnsi="BRH Malayalam Extra" w:cs="BRH Malayalam Extra"/>
-                <w:sz w:val="32"/>
-                <w:szCs w:val="40"/>
-              </w:rPr>
-              <w:lastRenderedPageBreak/>
-              <w:t>ªPâ</w:t>
+              <w:t>— ªPâ</w:t>
             </w:r>
             <w:r>
               <w:rPr>
@@ -37697,7 +37580,6 @@
                 <w:szCs w:val="40"/>
                 <w:lang w:val="it-IT"/>
               </w:rPr>
-              <w:lastRenderedPageBreak/>
               <w:t>32</w:t>
             </w:r>
             <w:r>
@@ -38403,17 +38285,7 @@
                 <w:szCs w:val="40"/>
                 <w:lang w:val="it-IT"/>
               </w:rPr>
-              <w:t xml:space="preserve"> </w:t>
-            </w:r>
-            <w:r>
-              <w:rPr>
-                <w:rFonts w:ascii="BRH Malayalam Extra" w:hAnsi="BRH Malayalam Extra" w:cs="BRH Malayalam Extra"/>
-                <w:sz w:val="32"/>
-                <w:szCs w:val="40"/>
-                <w:lang w:val="it-IT"/>
-              </w:rPr>
-              <w:lastRenderedPageBreak/>
-              <w:t>ªPâ</w:t>
+              <w:t xml:space="preserve"> ªPâ</w:t>
             </w:r>
             <w:r>
               <w:rPr>
@@ -38464,7 +38336,6 @@
                 <w:szCs w:val="40"/>
                 <w:lang w:val="it-IT"/>
               </w:rPr>
-              <w:lastRenderedPageBreak/>
               <w:t>63</w:t>
             </w:r>
             <w:r>
@@ -39949,6 +39820,7 @@
                 <w:szCs w:val="40"/>
                 <w:lang w:val="it-IT"/>
               </w:rPr>
+              <w:lastRenderedPageBreak/>
               <w:t>19</w:t>
             </w:r>
             <w:r>
@@ -40914,7 +40786,6 @@
                 <w:sz w:val="32"/>
                 <w:szCs w:val="40"/>
               </w:rPr>
-              <w:lastRenderedPageBreak/>
               <w:t>e</w:t>
             </w:r>
             <w:r>
@@ -41114,20 +40985,6 @@
               </w:rPr>
               <w:t xml:space="preserve"> sª¥p˜ | </w:t>
             </w:r>
-          </w:p>
-          <w:p>
-            <w:pPr>
-              <w:widowControl w:val="0"/>
-              <w:autoSpaceDE w:val="0"/>
-              <w:autoSpaceDN w:val="0"/>
-              <w:adjustRightInd w:val="0"/>
-              <w:spacing w:before="0" w:line="240" w:lineRule="auto"/>
-              <w:rPr>
-                <w:rFonts w:ascii="BRH Malayalam Extra" w:hAnsi="BRH Malayalam Extra" w:cs="BRH Malayalam Extra"/>
-                <w:sz w:val="32"/>
-                <w:szCs w:val="40"/>
-              </w:rPr>
-            </w:pPr>
           </w:p>
           <w:p>
             <w:pPr>
@@ -41413,7 +41270,6 @@
                 <w:rFonts w:cs="BRH Malayalam Extra"/>
                 <w:szCs w:val="40"/>
               </w:rPr>
-              <w:lastRenderedPageBreak/>
               <w:t>19</w:t>
             </w:r>
             <w:r>
@@ -42372,7 +42228,6 @@
                 <w:sz w:val="32"/>
                 <w:szCs w:val="40"/>
               </w:rPr>
-              <w:lastRenderedPageBreak/>
               <w:t>e</w:t>
             </w:r>
             <w:r>
@@ -42604,20 +42459,6 @@
               </w:rPr>
               <w:t xml:space="preserve"> sª¥p˜ | </w:t>
             </w:r>
-          </w:p>
-          <w:p>
-            <w:pPr>
-              <w:widowControl w:val="0"/>
-              <w:autoSpaceDE w:val="0"/>
-              <w:autoSpaceDN w:val="0"/>
-              <w:adjustRightInd w:val="0"/>
-              <w:spacing w:before="0" w:line="240" w:lineRule="auto"/>
-              <w:rPr>
-                <w:rFonts w:ascii="BRH Malayalam Extra" w:hAnsi="BRH Malayalam Extra" w:cs="BRH Malayalam Extra"/>
-                <w:sz w:val="32"/>
-                <w:szCs w:val="40"/>
-              </w:rPr>
-            </w:pPr>
           </w:p>
           <w:p>
             <w:pPr>
@@ -42903,7 +42744,6 @@
                 <w:rFonts w:cs="BRH Malayalam Extra"/>
                 <w:szCs w:val="40"/>
               </w:rPr>
-              <w:lastRenderedPageBreak/>
               <w:t>32</w:t>
             </w:r>
             <w:r>
@@ -43421,6 +43261,7 @@
                 <w:rFonts w:cs="BRH Malayalam Extra"/>
                 <w:szCs w:val="40"/>
               </w:rPr>
+              <w:lastRenderedPageBreak/>
               <w:t>33</w:t>
             </w:r>
             <w:r>
@@ -44479,7 +44320,6 @@
                 <w:sz w:val="32"/>
                 <w:szCs w:val="40"/>
               </w:rPr>
-              <w:lastRenderedPageBreak/>
               <w:t>öe</w:t>
             </w:r>
             <w:r>
@@ -45010,7 +44850,6 @@
                 <w:rFonts w:cs="BRH Malayalam Extra"/>
                 <w:szCs w:val="40"/>
               </w:rPr>
-              <w:lastRenderedPageBreak/>
               <w:t>33</w:t>
             </w:r>
             <w:r>
@@ -46181,7 +46020,6 @@
                 <w:sz w:val="32"/>
                 <w:szCs w:val="40"/>
               </w:rPr>
-              <w:lastRenderedPageBreak/>
               <w:t>öe</w:t>
             </w:r>
             <w:r>
@@ -46707,7 +46545,6 @@
                 <w:rFonts w:cs="BRH Malayalam Extra"/>
                 <w:szCs w:val="40"/>
               </w:rPr>
-              <w:lastRenderedPageBreak/>
               <w:t>41</w:t>
             </w:r>
             <w:r>
@@ -47108,6 +46945,7 @@
                 <w:rFonts w:cs="BRH Malayalam Extra"/>
                 <w:szCs w:val="40"/>
               </w:rPr>
+              <w:lastRenderedPageBreak/>
               <w:t>24</w:t>
             </w:r>
             <w:r>
@@ -48158,7 +47996,6 @@
                 <w:rFonts w:cs="BRH Malayalam Extra"/>
                 <w:szCs w:val="40"/>
               </w:rPr>
-              <w:lastRenderedPageBreak/>
               <w:t>24</w:t>
             </w:r>
             <w:r>
@@ -49289,18 +49126,6 @@
         </w:tc>
       </w:tr>
     </w:tbl>
-    <w:p>
-      <w:pPr>
-        <w:spacing w:before="0" w:line="240" w:lineRule="auto"/>
-        <w:rPr>
-          <w:b/>
-          <w:bCs/>
-          <w:sz w:val="32"/>
-          <w:szCs w:val="32"/>
-          <w:u w:val="single"/>
-        </w:rPr>
-      </w:pPr>
-    </w:p>
     <w:p>
       <w:pPr>
         <w:spacing w:before="0" w:line="240" w:lineRule="auto"/>
@@ -49323,18 +49148,6 @@
         </w:rPr>
         <w:t>====================</w:t>
       </w:r>
-    </w:p>
-    <w:p>
-      <w:pPr>
-        <w:spacing w:before="0" w:line="240" w:lineRule="auto"/>
-        <w:rPr>
-          <w:b/>
-          <w:bCs/>
-          <w:sz w:val="32"/>
-          <w:szCs w:val="32"/>
-          <w:u w:val="single"/>
-        </w:rPr>
-      </w:pPr>
     </w:p>
     <w:p>
       <w:pPr>

</xml_diff>